<commit_message>
Entrega Calculo 1 final
</commit_message>
<xml_diff>
--- a/documentos/Entrega 1/Calculo 1/Prototipo calculo 1.docx
+++ b/documentos/Entrega 1/Calculo 1/Prototipo calculo 1.docx
@@ -1,6 +1,6 @@
 
 <file path=word/document.xml><?xml version="1.0" encoding="utf-8"?>
-<w:document xmlns:wpc="http://schemas.microsoft.com/office/word/2010/wordprocessingCanvas" xmlns:cx="http://schemas.microsoft.com/office/drawing/2014/chartex" xmlns:cx1="http://schemas.microsoft.com/office/drawing/2015/9/8/chartex" xmlns:cx2="http://schemas.microsoft.com/office/drawing/2015/10/21/chartex" xmlns:cx3="http://schemas.microsoft.com/office/drawing/2016/5/9/chartex" xmlns:cx4="http://schemas.microsoft.com/office/drawing/2016/5/10/chartex" xmlns:cx5="http://schemas.microsoft.com/office/drawing/2016/5/11/chartex" xmlns:cx6="http://schemas.microsoft.com/office/drawing/2016/5/12/chartex" xmlns:cx7="http://schemas.microsoft.com/office/drawing/2016/5/13/chartex" xmlns:cx8="http://schemas.microsoft.com/office/drawing/2016/5/14/chartex" xmlns:mc="http://schemas.openxmlformats.org/markup-compatibility/2006" xmlns:aink="http://schemas.microsoft.com/office/drawing/2016/ink" xmlns:am3d="http://schemas.microsoft.com/office/drawing/2017/model3d" xmlns:o="urn:schemas-microsoft-com:office:office" xmlns:r="http://schemas.openxmlformats.org/officeDocument/2006/relationships" xmlns:m="http://schemas.openxmlformats.org/officeDocument/2006/math" xmlns:v="urn:schemas-microsoft-com:vml" xmlns:wp14="http://schemas.microsoft.com/office/word/2010/wordprocessingDrawing" xmlns:wp="http://schemas.openxmlformats.org/drawingml/2006/wordprocessingDrawing" xmlns:w10="urn:schemas-microsoft-com:office:word" xmlns:w="http://schemas.openxmlformats.org/wordprocessingml/2006/main" xmlns:w14="http://schemas.microsoft.com/office/word/2010/wordml" xmlns:w15="http://schemas.microsoft.com/office/word/2012/wordml" xmlns:w16cid="http://schemas.microsoft.com/office/word/2016/wordml/cid" xmlns:w16se="http://schemas.microsoft.com/office/word/2015/wordml/symex" xmlns:wpg="http://schemas.microsoft.com/office/word/2010/wordprocessingGroup" xmlns:wpi="http://schemas.microsoft.com/office/word/2010/wordprocessingInk" xmlns:wne="http://schemas.microsoft.com/office/word/2006/wordml" xmlns:wps="http://schemas.microsoft.com/office/word/2010/wordprocessingShape" mc:Ignorable="w14 w15 w16se w16cid wp14">
+<w:document xmlns:wpc="http://schemas.microsoft.com/office/word/2010/wordprocessingCanvas" xmlns:cx="http://schemas.microsoft.com/office/drawing/2014/chartex" xmlns:cx1="http://schemas.microsoft.com/office/drawing/2015/9/8/chartex" xmlns:cx2="http://schemas.microsoft.com/office/drawing/2015/10/21/chartex" xmlns:cx3="http://schemas.microsoft.com/office/drawing/2016/5/9/chartex" xmlns:cx4="http://schemas.microsoft.com/office/drawing/2016/5/10/chartex" xmlns:cx5="http://schemas.microsoft.com/office/drawing/2016/5/11/chartex" xmlns:cx6="http://schemas.microsoft.com/office/drawing/2016/5/12/chartex" xmlns:cx7="http://schemas.microsoft.com/office/drawing/2016/5/13/chartex" xmlns:cx8="http://schemas.microsoft.com/office/drawing/2016/5/14/chartex" xmlns:mc="http://schemas.openxmlformats.org/markup-compatibility/2006" xmlns:aink="http://schemas.microsoft.com/office/drawing/2016/ink" xmlns:am3d="http://schemas.microsoft.com/office/drawing/2017/model3d" xmlns:o="urn:schemas-microsoft-com:office:office" xmlns:oel="http://schemas.microsoft.com/office/2019/extlst" xmlns:r="http://schemas.openxmlformats.org/officeDocument/2006/relationships" xmlns:m="http://schemas.openxmlformats.org/officeDocument/2006/math" xmlns:v="urn:schemas-microsoft-com:vml" xmlns:wp14="http://schemas.microsoft.com/office/word/2010/wordprocessingDrawing" xmlns:wp="http://schemas.openxmlformats.org/drawingml/2006/wordprocessingDrawing" xmlns:w10="urn:schemas-microsoft-com:office:word" xmlns:w="http://schemas.openxmlformats.org/wordprocessingml/2006/main" xmlns:w14="http://schemas.microsoft.com/office/word/2010/wordml" xmlns:w15="http://schemas.microsoft.com/office/word/2012/wordml" xmlns:w16cex="http://schemas.microsoft.com/office/word/2018/wordml/cex" xmlns:w16cid="http://schemas.microsoft.com/office/word/2016/wordml/cid" xmlns:w16="http://schemas.microsoft.com/office/word/2018/wordml" xmlns:w16sdtdh="http://schemas.microsoft.com/office/word/2020/wordml/sdtdatahash" xmlns:w16se="http://schemas.microsoft.com/office/word/2015/wordml/symex" xmlns:wpg="http://schemas.microsoft.com/office/word/2010/wordprocessingGroup" xmlns:wpi="http://schemas.microsoft.com/office/word/2010/wordprocessingInk" xmlns:wne="http://schemas.microsoft.com/office/word/2006/wordml" xmlns:wps="http://schemas.microsoft.com/office/word/2010/wordprocessingShape" mc:Ignorable="w14 w15 w16se w16cid w16 w16cex w16sdtdh wp14">
   <w:body>
     <w:p>
       <w:pPr>
@@ -409,7 +409,7 @@
           <w:sz w:val="24"/>
           <w:szCs w:val="24"/>
         </w:rPr>
-        <w:t>TÍTULO DA ATIVIDADE:</w:t>
+        <w:t>TÍTULO DA ATIVIDADE</w:t>
       </w:r>
       <w:r>
         <w:rPr>
@@ -418,83 +418,8 @@
           <w:sz w:val="24"/>
           <w:szCs w:val="24"/>
         </w:rPr>
-        <w:t xml:space="preserve">                            Entrega Calculo 1 (Projeto Interdisciplinar)</w:t>
+        <w:t>:</w:t>
       </w:r>
-    </w:p>
-    <w:p>
-      <w:pPr>
-        <w:widowControl/>
-        <w:autoSpaceDE/>
-        <w:autoSpaceDN/>
-        <w:ind w:left="142"/>
-        <w:textAlignment w:val="baseline"/>
-        <w:rPr>
-          <w:rFonts w:ascii="Aptos Mono" w:hAnsi="Aptos Mono"/>
-          <w:b/>
-          <w:sz w:val="20"/>
-          <w:szCs w:val="20"/>
-        </w:rPr>
-      </w:pPr>
-    </w:p>
-    <w:p>
-      <w:pPr>
-        <w:widowControl/>
-        <w:autoSpaceDE/>
-        <w:autoSpaceDN/>
-        <w:ind w:left="142"/>
-        <w:textAlignment w:val="baseline"/>
-        <w:rPr>
-          <w:rFonts w:ascii="Aptos Mono" w:hAnsi="Aptos Mono"/>
-          <w:b/>
-          <w:sz w:val="20"/>
-          <w:szCs w:val="20"/>
-        </w:rPr>
-      </w:pPr>
-    </w:p>
-    <w:p>
-      <w:pPr>
-        <w:widowControl/>
-        <w:autoSpaceDE/>
-        <w:autoSpaceDN/>
-        <w:ind w:left="142"/>
-        <w:textAlignment w:val="baseline"/>
-        <w:rPr>
-          <w:rFonts w:ascii="Aptos Mono" w:hAnsi="Aptos Mono"/>
-          <w:b/>
-          <w:sz w:val="20"/>
-          <w:szCs w:val="20"/>
-        </w:rPr>
-      </w:pPr>
-    </w:p>
-    <w:p>
-      <w:pPr>
-        <w:widowControl/>
-        <w:autoSpaceDE/>
-        <w:autoSpaceDN/>
-        <w:ind w:left="142"/>
-        <w:textAlignment w:val="baseline"/>
-        <w:rPr>
-          <w:rFonts w:ascii="Aptos Mono" w:hAnsi="Aptos Mono"/>
-          <w:b/>
-          <w:sz w:val="20"/>
-          <w:szCs w:val="20"/>
-        </w:rPr>
-      </w:pPr>
-    </w:p>
-    <w:p>
-      <w:pPr>
-        <w:widowControl/>
-        <w:autoSpaceDE/>
-        <w:autoSpaceDN/>
-        <w:ind w:left="142"/>
-        <w:jc w:val="both"/>
-        <w:textAlignment w:val="baseline"/>
-        <w:rPr>
-          <w:rFonts w:ascii="Aptos Mono" w:hAnsi="Aptos Mono"/>
-          <w:sz w:val="20"/>
-          <w:szCs w:val="20"/>
-        </w:rPr>
-      </w:pPr>
       <w:r>
         <w:rPr>
           <w:rFonts w:ascii="Aptos Mono" w:hAnsi="Aptos Mono"/>
@@ -502,6 +427,91 @@
           <w:sz w:val="24"/>
           <w:szCs w:val="24"/>
         </w:rPr>
+        <w:t xml:space="preserve"> Entrega Calculo 1 (Projeto Interdisciplinar)</w:t>
+      </w:r>
+    </w:p>
+    <w:p>
+      <w:pPr>
+        <w:widowControl/>
+        <w:autoSpaceDE/>
+        <w:autoSpaceDN/>
+        <w:ind w:left="142"/>
+        <w:textAlignment w:val="baseline"/>
+        <w:rPr>
+          <w:rFonts w:ascii="Aptos Mono" w:hAnsi="Aptos Mono"/>
+          <w:b/>
+          <w:sz w:val="20"/>
+          <w:szCs w:val="20"/>
+        </w:rPr>
+      </w:pPr>
+    </w:p>
+    <w:p>
+      <w:pPr>
+        <w:widowControl/>
+        <w:autoSpaceDE/>
+        <w:autoSpaceDN/>
+        <w:ind w:left="142"/>
+        <w:textAlignment w:val="baseline"/>
+        <w:rPr>
+          <w:rFonts w:ascii="Aptos Mono" w:hAnsi="Aptos Mono"/>
+          <w:b/>
+          <w:sz w:val="20"/>
+          <w:szCs w:val="20"/>
+        </w:rPr>
+      </w:pPr>
+    </w:p>
+    <w:p>
+      <w:pPr>
+        <w:widowControl/>
+        <w:autoSpaceDE/>
+        <w:autoSpaceDN/>
+        <w:ind w:left="142"/>
+        <w:textAlignment w:val="baseline"/>
+        <w:rPr>
+          <w:rFonts w:ascii="Aptos Mono" w:hAnsi="Aptos Mono"/>
+          <w:b/>
+          <w:sz w:val="20"/>
+          <w:szCs w:val="20"/>
+        </w:rPr>
+      </w:pPr>
+    </w:p>
+    <w:p>
+      <w:pPr>
+        <w:widowControl/>
+        <w:autoSpaceDE/>
+        <w:autoSpaceDN/>
+        <w:ind w:left="142"/>
+        <w:textAlignment w:val="baseline"/>
+        <w:rPr>
+          <w:rFonts w:ascii="Aptos Mono" w:hAnsi="Aptos Mono"/>
+          <w:b/>
+          <w:sz w:val="20"/>
+          <w:szCs w:val="20"/>
+        </w:rPr>
+      </w:pPr>
+    </w:p>
+    <w:p>
+      <w:pPr>
+        <w:widowControl/>
+        <w:autoSpaceDE/>
+        <w:autoSpaceDN/>
+        <w:ind w:left="142"/>
+        <w:jc w:val="both"/>
+        <w:textAlignment w:val="baseline"/>
+        <w:rPr>
+          <w:rFonts w:ascii="Aptos Mono" w:hAnsi="Aptos Mono"/>
+          <w:sz w:val="20"/>
+          <w:szCs w:val="20"/>
+          <w:lang w:val="pt-BR"/>
+        </w:rPr>
+      </w:pPr>
+      <w:r>
+        <w:rPr>
+          <w:rFonts w:ascii="Aptos Mono" w:hAnsi="Aptos Mono"/>
+          <w:b/>
+          <w:sz w:val="24"/>
+          <w:szCs w:val="24"/>
+        </w:rPr>
         <w:t>Introdução:</w:t>
       </w:r>
       <w:r>
@@ -518,62 +528,29 @@
           <w:rFonts w:ascii="Aptos Mono" w:hAnsi="Aptos Mono"/>
           <w:sz w:val="20"/>
           <w:szCs w:val="20"/>
-        </w:rPr>
-        <w:t>A proposta de nosso jogo irá girar entorno de jogos com o tema de clickers, semelhantes ao mundialmente conhecido cookie clicker e outros, mas em nosso caso focado com o tema de desenvolvedor, ou seja, seus amplos fatores irão girar entorno de computadores, codigos, linguagens de programação e etc.</w:t>
-      </w:r>
-    </w:p>
-    <w:p>
-      <w:pPr>
-        <w:widowControl/>
-        <w:autoSpaceDE/>
-        <w:autoSpaceDN/>
-        <w:ind w:left="142"/>
-        <w:jc w:val="both"/>
-        <w:textAlignment w:val="baseline"/>
-        <w:rPr>
-          <w:rFonts w:ascii="Aptos Mono" w:hAnsi="Aptos Mono"/>
-          <w:sz w:val="20"/>
-          <w:szCs w:val="20"/>
-        </w:rPr>
-      </w:pPr>
-    </w:p>
-    <w:p>
-      <w:pPr>
-        <w:widowControl/>
-        <w:autoSpaceDE/>
-        <w:autoSpaceDN/>
-        <w:ind w:left="142"/>
-        <w:jc w:val="both"/>
-        <w:textAlignment w:val="baseline"/>
-        <w:rPr>
-          <w:rFonts w:ascii="Aptos Mono" w:hAnsi="Aptos Mono"/>
-          <w:sz w:val="20"/>
-          <w:szCs w:val="20"/>
-        </w:rPr>
-      </w:pPr>
-      <w:r>
-        <w:rPr>
-          <w:rFonts w:ascii="Aptos Mono" w:hAnsi="Aptos Mono"/>
-          <w:sz w:val="20"/>
-          <w:szCs w:val="20"/>
-        </w:rPr>
-        <w:t>Dito isso, o jogo ja conversa muito bem com a matemática, mas por hora infelizmente somente em seu código, então iremos complementar isso com os jogadores,</w:t>
+          <w:lang w:val="pt-BR"/>
+        </w:rPr>
+        <w:t xml:space="preserve">O jogo desenvolvido pelo grupo segue o estilo </w:t>
       </w:r>
       <w:r>
         <w:rPr>
           <w:rFonts w:ascii="Aptos Mono" w:hAnsi="Aptos Mono"/>
-          <w:sz w:val="20"/>
-          <w:szCs w:val="20"/>
-        </w:rPr>
-        <w:t xml:space="preserve"> começando primeiro com a conversação com seu código ja existente, neste caso iremos implementar</w:t>
+          <w:i/>
+          <w:iCs/>
+          <w:sz w:val="20"/>
+          <w:szCs w:val="20"/>
+          <w:lang w:val="pt-BR"/>
+        </w:rPr>
+        <w:t>clicker</w:t>
       </w:r>
       <w:r>
         <w:rPr>
           <w:rFonts w:ascii="Aptos Mono" w:hAnsi="Aptos Mono"/>
           <w:sz w:val="20"/>
           <w:szCs w:val="20"/>
-        </w:rPr>
-        <w:t xml:space="preserve"> funções de calculo nas compras de seus aparelhos, de seus cursos de programação e entre outros, todos esses fatores ja existem, mas serão combinados com a matematica, transformando algo educativo em recompensador.</w:t>
+          <w:lang w:val="pt-BR"/>
+        </w:rPr>
+        <w:t>, inspirado em jogos como Cookie Clicker, porém com temática voltada ao universo da programação. O jogador assume o papel de um desenvolvedor que evolui sua carreira através de upgrades como linguagens de programação, computadores e automações.</w:t>
       </w:r>
     </w:p>
     <w:p>
@@ -588,87 +565,547 @@
           <w:rFonts w:ascii="Aptos Mono" w:hAnsi="Aptos Mono"/>
           <w:sz w:val="20"/>
           <w:szCs w:val="20"/>
-        </w:rPr>
-      </w:pPr>
-    </w:p>
-    <w:p>
-      <w:pPr>
-        <w:widowControl/>
-        <w:autoSpaceDE/>
-        <w:autoSpaceDN/>
-        <w:ind w:left="142"/>
-        <w:jc w:val="both"/>
-        <w:textAlignment w:val="baseline"/>
-        <w:rPr>
-          <w:rFonts w:ascii="Aptos Mono" w:hAnsi="Aptos Mono"/>
-          <w:sz w:val="20"/>
-          <w:szCs w:val="20"/>
-        </w:rPr>
-      </w:pPr>
-    </w:p>
-    <w:p>
-      <w:pPr>
-        <w:widowControl/>
-        <w:autoSpaceDE/>
-        <w:autoSpaceDN/>
-        <w:ind w:left="142"/>
-        <w:jc w:val="both"/>
-        <w:textAlignment w:val="baseline"/>
-        <w:rPr>
-          <w:rFonts w:ascii="Aptos Mono" w:hAnsi="Aptos Mono"/>
-          <w:sz w:val="20"/>
-          <w:szCs w:val="20"/>
-        </w:rPr>
-      </w:pPr>
-    </w:p>
-    <w:p>
-      <w:pPr>
-        <w:widowControl/>
-        <w:autoSpaceDE/>
-        <w:autoSpaceDN/>
-        <w:ind w:left="142"/>
-        <w:jc w:val="both"/>
-        <w:textAlignment w:val="baseline"/>
-        <w:rPr>
-          <w:rFonts w:ascii="Aptos Mono" w:hAnsi="Aptos Mono"/>
-          <w:sz w:val="20"/>
-          <w:szCs w:val="20"/>
+          <w:lang w:val="pt-BR"/>
         </w:rPr>
       </w:pPr>
       <w:r>
         <w:rPr>
           <w:rFonts w:ascii="Aptos Mono" w:hAnsi="Aptos Mono"/>
+          <w:sz w:val="20"/>
+          <w:szCs w:val="20"/>
+          <w:lang w:val="pt-BR"/>
+        </w:rPr>
+        <w:t>A mecânica principal gira em torno de três fatores:</w:t>
+      </w:r>
+    </w:p>
+    <w:p>
+      <w:pPr>
+        <w:widowControl/>
+        <w:autoSpaceDE/>
+        <w:autoSpaceDN/>
+        <w:ind w:left="142"/>
+        <w:jc w:val="both"/>
+        <w:textAlignment w:val="baseline"/>
+        <w:rPr>
+          <w:rFonts w:ascii="Aptos Mono" w:hAnsi="Aptos Mono"/>
+          <w:sz w:val="20"/>
+          <w:szCs w:val="20"/>
+          <w:lang w:val="pt-BR"/>
+        </w:rPr>
+      </w:pPr>
+    </w:p>
+    <w:p>
+      <w:pPr>
+        <w:widowControl/>
+        <w:numPr>
+          <w:ilvl w:val="0"/>
+          <w:numId w:val="29"/>
+        </w:numPr>
+        <w:autoSpaceDE/>
+        <w:autoSpaceDN/>
+        <w:jc w:val="both"/>
+        <w:textAlignment w:val="baseline"/>
+        <w:rPr>
+          <w:rFonts w:ascii="Aptos Mono" w:hAnsi="Aptos Mono"/>
+          <w:sz w:val="20"/>
+          <w:szCs w:val="20"/>
+          <w:lang w:val="pt-BR"/>
+        </w:rPr>
+      </w:pPr>
+      <w:r>
+        <w:rPr>
+          <w:rFonts w:ascii="Aptos Mono" w:hAnsi="Aptos Mono"/>
+          <w:sz w:val="20"/>
+          <w:szCs w:val="20"/>
+          <w:lang w:val="pt-BR"/>
+        </w:rPr>
+        <w:t>ganho de dinheiro por clique (relacionado à linguagem utilizada);</w:t>
+      </w:r>
+    </w:p>
+    <w:p>
+      <w:pPr>
+        <w:widowControl/>
+        <w:autoSpaceDE/>
+        <w:autoSpaceDN/>
+        <w:ind w:left="720"/>
+        <w:jc w:val="both"/>
+        <w:textAlignment w:val="baseline"/>
+        <w:rPr>
+          <w:rFonts w:ascii="Aptos Mono" w:hAnsi="Aptos Mono"/>
+          <w:sz w:val="20"/>
+          <w:szCs w:val="20"/>
+          <w:lang w:val="pt-BR"/>
+        </w:rPr>
+      </w:pPr>
+    </w:p>
+    <w:p>
+      <w:pPr>
+        <w:widowControl/>
+        <w:numPr>
+          <w:ilvl w:val="0"/>
+          <w:numId w:val="29"/>
+        </w:numPr>
+        <w:autoSpaceDE/>
+        <w:autoSpaceDN/>
+        <w:jc w:val="both"/>
+        <w:textAlignment w:val="baseline"/>
+        <w:rPr>
+          <w:rFonts w:ascii="Aptos Mono" w:hAnsi="Aptos Mono"/>
+          <w:sz w:val="20"/>
+          <w:szCs w:val="20"/>
+          <w:lang w:val="pt-BR"/>
+        </w:rPr>
+      </w:pPr>
+      <w:r>
+        <w:rPr>
+          <w:rFonts w:ascii="Aptos Mono" w:hAnsi="Aptos Mono"/>
+          <w:sz w:val="20"/>
+          <w:szCs w:val="20"/>
+          <w:lang w:val="pt-BR"/>
+        </w:rPr>
+        <w:t>limite de dinheiro (relacionado ao hardware);</w:t>
+      </w:r>
+    </w:p>
+    <w:p>
+      <w:pPr>
+        <w:widowControl/>
+        <w:autoSpaceDE/>
+        <w:autoSpaceDN/>
+        <w:ind w:left="360"/>
+        <w:jc w:val="both"/>
+        <w:textAlignment w:val="baseline"/>
+        <w:rPr>
+          <w:rFonts w:ascii="Aptos Mono" w:hAnsi="Aptos Mono"/>
+          <w:sz w:val="20"/>
+          <w:szCs w:val="20"/>
+          <w:lang w:val="pt-BR"/>
+        </w:rPr>
+      </w:pPr>
+    </w:p>
+    <w:p>
+      <w:pPr>
+        <w:widowControl/>
+        <w:numPr>
+          <w:ilvl w:val="0"/>
+          <w:numId w:val="29"/>
+        </w:numPr>
+        <w:autoSpaceDE/>
+        <w:autoSpaceDN/>
+        <w:jc w:val="both"/>
+        <w:textAlignment w:val="baseline"/>
+        <w:rPr>
+          <w:rFonts w:ascii="Aptos Mono" w:hAnsi="Aptos Mono"/>
+          <w:sz w:val="20"/>
+          <w:szCs w:val="20"/>
+          <w:lang w:val="pt-BR"/>
+        </w:rPr>
+      </w:pPr>
+      <w:r>
+        <w:rPr>
+          <w:rFonts w:ascii="Aptos Mono" w:hAnsi="Aptos Mono"/>
+          <w:sz w:val="20"/>
+          <w:szCs w:val="20"/>
+          <w:lang w:val="pt-BR"/>
+        </w:rPr>
+        <w:t>geração automática de cliques (relacionada à automação em código).</w:t>
+      </w:r>
+    </w:p>
+    <w:p>
+      <w:pPr>
+        <w:widowControl/>
+        <w:autoSpaceDE/>
+        <w:autoSpaceDN/>
+        <w:ind w:left="720"/>
+        <w:jc w:val="both"/>
+        <w:textAlignment w:val="baseline"/>
+        <w:rPr>
+          <w:rFonts w:ascii="Aptos Mono" w:hAnsi="Aptos Mono"/>
+          <w:sz w:val="20"/>
+          <w:szCs w:val="20"/>
+          <w:lang w:val="pt-BR"/>
+        </w:rPr>
+      </w:pPr>
+    </w:p>
+    <w:p>
+      <w:pPr>
+        <w:widowControl/>
+        <w:autoSpaceDE/>
+        <w:autoSpaceDN/>
+        <w:ind w:left="142"/>
+        <w:jc w:val="both"/>
+        <w:textAlignment w:val="baseline"/>
+        <w:rPr>
+          <w:rFonts w:ascii="Aptos Mono" w:hAnsi="Aptos Mono"/>
+          <w:sz w:val="20"/>
+          <w:szCs w:val="20"/>
+          <w:lang w:val="pt-BR"/>
+        </w:rPr>
+      </w:pPr>
+      <w:r>
+        <w:rPr>
+          <w:rFonts w:ascii="Aptos Mono" w:hAnsi="Aptos Mono"/>
+          <w:sz w:val="20"/>
+          <w:szCs w:val="20"/>
+          <w:lang w:val="pt-BR"/>
+        </w:rPr>
+        <w:t xml:space="preserve">O objetivo do jogador é evoluir esses aspectos para progredir no jogo, enfrentando </w:t>
+      </w:r>
+      <w:r>
+        <w:rPr>
+          <w:rFonts w:ascii="Aptos Mono" w:hAnsi="Aptos Mono"/>
+          <w:sz w:val="20"/>
+          <w:szCs w:val="20"/>
+          <w:lang w:val="pt-BR"/>
+        </w:rPr>
+        <w:t xml:space="preserve">desafios </w:t>
+      </w:r>
+      <w:r>
+        <w:rPr>
+          <w:rFonts w:ascii="Aptos Mono" w:hAnsi="Aptos Mono"/>
+          <w:sz w:val="20"/>
+          <w:szCs w:val="20"/>
+          <w:lang w:val="pt-BR"/>
+        </w:rPr>
+        <w:t>matemáticos</w:t>
+      </w:r>
+      <w:r>
+        <w:rPr>
+          <w:rFonts w:ascii="Aptos Mono" w:hAnsi="Aptos Mono"/>
+          <w:sz w:val="20"/>
+          <w:szCs w:val="20"/>
+          <w:lang w:val="pt-BR"/>
+        </w:rPr>
+        <w:t xml:space="preserve"> que simulam decisões reais do mundo tecnológico, como cálculos de custo, eficiência e otimização.</w:t>
+      </w:r>
+    </w:p>
+    <w:p>
+      <w:pPr>
+        <w:widowControl/>
+        <w:autoSpaceDE/>
+        <w:autoSpaceDN/>
+        <w:ind w:left="142"/>
+        <w:jc w:val="both"/>
+        <w:textAlignment w:val="baseline"/>
+        <w:rPr>
+          <w:rFonts w:ascii="Aptos Mono" w:hAnsi="Aptos Mono"/>
+          <w:sz w:val="20"/>
+          <w:szCs w:val="20"/>
+        </w:rPr>
+      </w:pPr>
+    </w:p>
+    <w:p>
+      <w:pPr>
+        <w:widowControl/>
+        <w:autoSpaceDE/>
+        <w:autoSpaceDN/>
+        <w:ind w:left="142"/>
+        <w:jc w:val="both"/>
+        <w:textAlignment w:val="baseline"/>
+        <w:rPr>
+          <w:rFonts w:ascii="Aptos Mono" w:hAnsi="Aptos Mono"/>
+          <w:sz w:val="20"/>
+          <w:szCs w:val="20"/>
+        </w:rPr>
+      </w:pPr>
+    </w:p>
+    <w:p>
+      <w:pPr>
+        <w:widowControl/>
+        <w:autoSpaceDE/>
+        <w:autoSpaceDN/>
+        <w:ind w:left="142"/>
+        <w:jc w:val="both"/>
+        <w:textAlignment w:val="baseline"/>
+        <w:rPr>
+          <w:rFonts w:ascii="Aptos Mono" w:hAnsi="Aptos Mono"/>
+          <w:sz w:val="20"/>
+          <w:szCs w:val="20"/>
+        </w:rPr>
+      </w:pPr>
+    </w:p>
+    <w:p>
+      <w:pPr>
+        <w:widowControl/>
+        <w:autoSpaceDE/>
+        <w:autoSpaceDN/>
+        <w:ind w:left="142"/>
+        <w:jc w:val="both"/>
+        <w:textAlignment w:val="baseline"/>
+        <w:rPr>
+          <w:rFonts w:ascii="Aptos Mono" w:hAnsi="Aptos Mono"/>
+          <w:sz w:val="20"/>
+          <w:szCs w:val="20"/>
+        </w:rPr>
+      </w:pPr>
+    </w:p>
+    <w:p>
+      <w:pPr>
+        <w:widowControl/>
+        <w:autoSpaceDE/>
+        <w:autoSpaceDN/>
+        <w:ind w:left="142"/>
+        <w:jc w:val="both"/>
+        <w:textAlignment w:val="baseline"/>
+        <w:rPr>
+          <w:rFonts w:ascii="Aptos Mono" w:hAnsi="Aptos Mono"/>
+          <w:sz w:val="20"/>
+          <w:szCs w:val="20"/>
+        </w:rPr>
+      </w:pPr>
+    </w:p>
+    <w:p>
+      <w:pPr>
+        <w:widowControl/>
+        <w:autoSpaceDE/>
+        <w:autoSpaceDN/>
+        <w:ind w:left="142"/>
+        <w:jc w:val="both"/>
+        <w:textAlignment w:val="baseline"/>
+        <w:rPr>
+          <w:rFonts w:ascii="Aptos Mono" w:hAnsi="Aptos Mono"/>
           <w:b/>
+          <w:bCs/>
           <w:sz w:val="24"/>
           <w:szCs w:val="24"/>
-        </w:rPr>
-        <w:t>Construção:</w:t>
+          <w:lang w:val="pt-BR"/>
+        </w:rPr>
+      </w:pPr>
+      <w:r>
+        <w:rPr>
+          <w:rFonts w:ascii="Aptos Mono" w:hAnsi="Aptos Mono"/>
+          <w:b/>
+          <w:bCs/>
+          <w:noProof/>
+          <w:sz w:val="24"/>
+          <w:szCs w:val="24"/>
+          <w:lang w:val="pt-BR"/>
+        </w:rPr>
+        <w:drawing>
+          <wp:anchor distT="0" distB="0" distL="114300" distR="114300" simplePos="0" relativeHeight="251658240" behindDoc="0" locked="0" layoutInCell="1" allowOverlap="1" wp14:anchorId="4CE4E6B6" wp14:editId="784BE467">
+            <wp:simplePos x="0" y="0"/>
+            <wp:positionH relativeFrom="margin">
+              <wp:align>right</wp:align>
+            </wp:positionH>
+            <wp:positionV relativeFrom="paragraph">
+              <wp:posOffset>5080</wp:posOffset>
+            </wp:positionV>
+            <wp:extent cx="1847850" cy="2771775"/>
+            <wp:effectExtent l="0" t="0" r="0" b="9525"/>
+            <wp:wrapThrough wrapText="bothSides">
+              <wp:wrapPolygon edited="0">
+                <wp:start x="0" y="0"/>
+                <wp:lineTo x="0" y="21526"/>
+                <wp:lineTo x="21377" y="21526"/>
+                <wp:lineTo x="21377" y="0"/>
+                <wp:lineTo x="0" y="0"/>
+              </wp:wrapPolygon>
+            </wp:wrapThrough>
+            <wp:docPr id="2" name="Imagem 2" descr="Placa branca com texto preto sobre fundo branco&#10;&#10;O conteúdo gerado por IA pode estar incorreto."/>
+            <wp:cNvGraphicFramePr>
+              <a:graphicFrameLocks xmlns:a="http://schemas.openxmlformats.org/drawingml/2006/main" noChangeAspect="1"/>
+            </wp:cNvGraphicFramePr>
+            <a:graphic xmlns:a="http://schemas.openxmlformats.org/drawingml/2006/main">
+              <a:graphicData uri="http://schemas.openxmlformats.org/drawingml/2006/picture">
+                <pic:pic xmlns:pic="http://schemas.openxmlformats.org/drawingml/2006/picture">
+                  <pic:nvPicPr>
+                    <pic:cNvPr id="2" name="Imagem 2" descr="Placa branca com texto preto sobre fundo branco&#10;&#10;O conteúdo gerado por IA pode estar incorreto."/>
+                    <pic:cNvPicPr/>
+                  </pic:nvPicPr>
+                  <pic:blipFill>
+                    <a:blip r:embed="rId8" cstate="print">
+                      <a:extLst>
+                        <a:ext uri="{28A0092B-C50C-407E-A947-70E740481C1C}">
+                          <a14:useLocalDpi xmlns:a14="http://schemas.microsoft.com/office/drawing/2010/main" val="0"/>
+                        </a:ext>
+                      </a:extLst>
+                    </a:blip>
+                    <a:stretch>
+                      <a:fillRect/>
+                    </a:stretch>
+                  </pic:blipFill>
+                  <pic:spPr>
+                    <a:xfrm>
+                      <a:off x="0" y="0"/>
+                      <a:ext cx="1847850" cy="2771775"/>
+                    </a:xfrm>
+                    <a:prstGeom prst="rect">
+                      <a:avLst/>
+                    </a:prstGeom>
+                  </pic:spPr>
+                </pic:pic>
+              </a:graphicData>
+            </a:graphic>
+            <wp14:sizeRelH relativeFrom="margin">
+              <wp14:pctWidth>0</wp14:pctWidth>
+            </wp14:sizeRelH>
+            <wp14:sizeRelV relativeFrom="margin">
+              <wp14:pctHeight>0</wp14:pctHeight>
+            </wp14:sizeRelV>
+          </wp:anchor>
+        </w:drawing>
       </w:r>
       <w:r>
         <w:rPr>
           <w:rFonts w:ascii="Aptos Mono" w:hAnsi="Aptos Mono"/>
           <w:b/>
+          <w:bCs/>
           <w:sz w:val="24"/>
           <w:szCs w:val="24"/>
-        </w:rPr>
-        <w:t xml:space="preserve"> </w:t>
+          <w:lang w:val="pt-BR"/>
+        </w:rPr>
+        <w:t>Desafio 1 – Potenciação e Radiciação</w:t>
       </w:r>
       <w:r>
         <w:rPr>
           <w:rFonts w:ascii="Aptos Mono" w:hAnsi="Aptos Mono"/>
           <w:b/>
+          <w:bCs/>
           <w:sz w:val="24"/>
           <w:szCs w:val="24"/>
-        </w:rPr>
-        <w:t xml:space="preserve"> </w:t>
+          <w:lang w:val="pt-BR"/>
+        </w:rPr>
+        <w:t>:</w:t>
+      </w:r>
+    </w:p>
+    <w:p>
+      <w:pPr>
+        <w:widowControl/>
+        <w:autoSpaceDE/>
+        <w:autoSpaceDN/>
+        <w:ind w:left="142"/>
+        <w:jc w:val="both"/>
+        <w:textAlignment w:val="baseline"/>
+        <w:rPr>
+          <w:rFonts w:ascii="Aptos Mono" w:hAnsi="Aptos Mono"/>
+          <w:b/>
+          <w:bCs/>
+          <w:sz w:val="24"/>
+          <w:szCs w:val="24"/>
+          <w:lang w:val="pt-BR"/>
+        </w:rPr>
+      </w:pPr>
+    </w:p>
+    <w:p>
+      <w:pPr>
+        <w:widowControl/>
+        <w:autoSpaceDE/>
+        <w:autoSpaceDN/>
+        <w:ind w:left="142"/>
+        <w:jc w:val="both"/>
+        <w:textAlignment w:val="baseline"/>
+        <w:rPr>
+          <w:rFonts w:ascii="Aptos Mono" w:hAnsi="Aptos Mono"/>
+          <w:sz w:val="20"/>
+          <w:szCs w:val="20"/>
+          <w:lang w:val="pt-BR"/>
+        </w:rPr>
+      </w:pPr>
+      <w:r>
+        <w:rPr>
+          <w:rFonts w:ascii="Aptos Mono" w:hAnsi="Aptos Mono"/>
+          <w:sz w:val="20"/>
+          <w:szCs w:val="20"/>
+          <w:lang w:val="pt-BR"/>
+        </w:rPr>
+        <w:t>O jogador tenta desbloquear um supercomputador avançado. Para isso, ele precisa calcular corretamente o poder de processamento exigido pelo sistema.</w:t>
+      </w:r>
+    </w:p>
+    <w:p>
+      <w:pPr>
+        <w:widowControl/>
+        <w:autoSpaceDE/>
+        <w:autoSpaceDN/>
+        <w:ind w:left="142"/>
+        <w:jc w:val="both"/>
+        <w:textAlignment w:val="baseline"/>
+        <w:rPr>
+          <w:rFonts w:ascii="Aptos Mono" w:hAnsi="Aptos Mono"/>
+          <w:sz w:val="20"/>
+          <w:szCs w:val="20"/>
+          <w:lang w:val="pt-BR"/>
+        </w:rPr>
+      </w:pPr>
+      <w:r>
+        <w:rPr>
+          <w:rFonts w:ascii="Aptos Mono" w:hAnsi="Aptos Mono"/>
+          <w:sz w:val="20"/>
+          <w:szCs w:val="20"/>
+          <w:lang w:val="pt-BR"/>
+        </w:rPr>
+        <w:t>Enunciado:</w:t>
       </w:r>
       <w:r>
         <w:rPr>
           <w:rFonts w:ascii="Aptos Mono" w:hAnsi="Aptos Mono"/>
           <w:sz w:val="20"/>
           <w:szCs w:val="20"/>
-        </w:rPr>
-        <w:t>O jogo terá em seu sistemas de compras para o hardware calculos avançados, levando em consideração tarifas, taxas e calculos avançados. Por exemplo: o jogo terá sua funcionalidade de comprar computadores como upgrades, e o preço desses computadores terão que ser estipulados pelo proprio usuario</w:t>
+          <w:lang w:val="pt-BR"/>
+        </w:rPr>
+        <w:br/>
+      </w:r>
+    </w:p>
+    <w:p>
+      <w:pPr>
+        <w:widowControl/>
+        <w:autoSpaceDE/>
+        <w:autoSpaceDN/>
+        <w:ind w:left="142"/>
+        <w:jc w:val="both"/>
+        <w:textAlignment w:val="baseline"/>
+        <w:rPr>
+          <w:rFonts w:ascii="Aptos Mono" w:hAnsi="Aptos Mono"/>
+          <w:sz w:val="20"/>
+          <w:szCs w:val="20"/>
+          <w:lang w:val="pt-BR"/>
+        </w:rPr>
+      </w:pPr>
+      <w:r>
+        <w:rPr>
+          <w:rFonts w:ascii="Aptos Mono" w:hAnsi="Aptos Mono"/>
+          <w:sz w:val="20"/>
+          <w:szCs w:val="20"/>
+          <w:lang w:val="pt-BR"/>
+        </w:rPr>
+        <w:t>O sistema exige que o jogador resolva a seguinte expressão para validar a compra do supercomputador:</w:t>
+      </w:r>
+    </w:p>
+    <w:p>
+      <w:pPr>
+        <w:widowControl/>
+        <w:autoSpaceDE/>
+        <w:autoSpaceDN/>
+        <w:ind w:left="142"/>
+        <w:jc w:val="both"/>
+        <w:textAlignment w:val="baseline"/>
+        <w:rPr>
+          <w:rFonts w:ascii="Aptos Mono" w:hAnsi="Aptos Mono"/>
+          <w:sz w:val="20"/>
+          <w:szCs w:val="20"/>
+        </w:rPr>
+      </w:pPr>
+    </w:p>
+    <w:p>
+      <w:pPr>
+        <w:widowControl/>
+        <w:autoSpaceDE/>
+        <w:autoSpaceDN/>
+        <w:ind w:left="142"/>
+        <w:textAlignment w:val="baseline"/>
+        <w:rPr>
+          <w:rFonts w:ascii="Aptos Mono" w:hAnsi="Aptos Mono"/>
+          <w:sz w:val="20"/>
+          <w:szCs w:val="20"/>
+        </w:rPr>
+      </w:pPr>
+      <w:r>
+        <w:rPr>
+          <w:rFonts w:ascii="Aptos Mono" w:hAnsi="Aptos Mono"/>
+          <w:b/>
+          <w:bCs/>
+          <w:sz w:val="20"/>
+          <w:szCs w:val="20"/>
+        </w:rPr>
+        <w:t>Como ajuda no jogo:</w:t>
       </w:r>
       <w:r>
         <w:rPr>
@@ -676,7 +1113,8 @@
           <w:sz w:val="20"/>
           <w:szCs w:val="20"/>
         </w:rPr>
-        <w:t xml:space="preserve"> se não ele irá pagar mais do que o correto pelo produto, ou se estipulado um preço menor do que é, o comprador irá recusar a compra do computador e entrar em cooldown (em recesso).</w:t>
+        <w:br/>
+        <w:t>Se o jogador acertar, desbloqueia o supercomputador, aumentando significativamente seu limite de dinheiro.</w:t>
       </w:r>
     </w:p>
     <w:p>
@@ -734,67 +1172,1393 @@
         <w:textAlignment w:val="baseline"/>
         <w:rPr>
           <w:rFonts w:ascii="Aptos Mono" w:hAnsi="Aptos Mono"/>
+          <w:sz w:val="20"/>
+          <w:szCs w:val="20"/>
+        </w:rPr>
+      </w:pPr>
+    </w:p>
+    <w:p>
+      <w:pPr>
+        <w:widowControl/>
+        <w:autoSpaceDE/>
+        <w:autoSpaceDN/>
+        <w:ind w:left="142"/>
+        <w:jc w:val="both"/>
+        <w:textAlignment w:val="baseline"/>
+        <w:rPr>
+          <w:rFonts w:ascii="Aptos Mono" w:hAnsi="Aptos Mono"/>
+          <w:sz w:val="20"/>
+          <w:szCs w:val="20"/>
+        </w:rPr>
+      </w:pPr>
+    </w:p>
+    <w:p>
+      <w:pPr>
+        <w:widowControl/>
+        <w:autoSpaceDE/>
+        <w:autoSpaceDN/>
+        <w:ind w:left="142"/>
+        <w:jc w:val="both"/>
+        <w:textAlignment w:val="baseline"/>
+        <w:rPr>
+          <w:rFonts w:ascii="Aptos Mono" w:hAnsi="Aptos Mono"/>
+          <w:sz w:val="20"/>
+          <w:szCs w:val="20"/>
+        </w:rPr>
+      </w:pPr>
+    </w:p>
+    <w:p>
+      <w:pPr>
+        <w:widowControl/>
+        <w:autoSpaceDE/>
+        <w:autoSpaceDN/>
+        <w:ind w:left="142"/>
+        <w:jc w:val="both"/>
+        <w:textAlignment w:val="baseline"/>
+        <w:rPr>
+          <w:rFonts w:ascii="Aptos Mono" w:hAnsi="Aptos Mono"/>
+          <w:sz w:val="20"/>
+          <w:szCs w:val="20"/>
+        </w:rPr>
+      </w:pPr>
+    </w:p>
+    <w:p>
+      <w:pPr>
+        <w:widowControl/>
+        <w:autoSpaceDE/>
+        <w:autoSpaceDN/>
+        <w:ind w:left="142"/>
+        <w:jc w:val="both"/>
+        <w:textAlignment w:val="baseline"/>
+        <w:rPr>
+          <w:rFonts w:ascii="Aptos Mono" w:hAnsi="Aptos Mono"/>
+          <w:sz w:val="20"/>
+          <w:szCs w:val="20"/>
+        </w:rPr>
+      </w:pPr>
+    </w:p>
+    <w:p>
+      <w:pPr>
+        <w:widowControl/>
+        <w:autoSpaceDE/>
+        <w:autoSpaceDN/>
+        <w:ind w:left="142"/>
+        <w:jc w:val="both"/>
+        <w:textAlignment w:val="baseline"/>
+        <w:rPr>
+          <w:rFonts w:ascii="Aptos Mono" w:hAnsi="Aptos Mono"/>
+          <w:sz w:val="20"/>
+          <w:szCs w:val="20"/>
+        </w:rPr>
+      </w:pPr>
+    </w:p>
+    <w:p>
+      <w:pPr>
+        <w:widowControl/>
+        <w:autoSpaceDE/>
+        <w:autoSpaceDN/>
+        <w:ind w:left="142"/>
+        <w:jc w:val="both"/>
+        <w:textAlignment w:val="baseline"/>
+        <w:rPr>
+          <w:rFonts w:ascii="Aptos Mono" w:hAnsi="Aptos Mono"/>
+          <w:sz w:val="20"/>
+          <w:szCs w:val="20"/>
+        </w:rPr>
+      </w:pPr>
+    </w:p>
+    <w:p>
+      <w:pPr>
+        <w:widowControl/>
+        <w:autoSpaceDE/>
+        <w:autoSpaceDN/>
+        <w:ind w:left="142"/>
+        <w:jc w:val="both"/>
+        <w:textAlignment w:val="baseline"/>
+        <w:rPr>
+          <w:rFonts w:ascii="Aptos Mono" w:hAnsi="Aptos Mono"/>
+          <w:sz w:val="20"/>
+          <w:szCs w:val="20"/>
+        </w:rPr>
+      </w:pPr>
+    </w:p>
+    <w:p>
+      <w:pPr>
+        <w:widowControl/>
+        <w:autoSpaceDE/>
+        <w:autoSpaceDN/>
+        <w:ind w:left="142"/>
+        <w:jc w:val="both"/>
+        <w:textAlignment w:val="baseline"/>
+        <w:rPr>
+          <w:rFonts w:ascii="Aptos Mono" w:hAnsi="Aptos Mono"/>
+          <w:sz w:val="20"/>
+          <w:szCs w:val="20"/>
+        </w:rPr>
+      </w:pPr>
+    </w:p>
+    <w:p>
+      <w:pPr>
+        <w:widowControl/>
+        <w:autoSpaceDE/>
+        <w:autoSpaceDN/>
+        <w:ind w:left="142"/>
+        <w:jc w:val="both"/>
+        <w:textAlignment w:val="baseline"/>
+        <w:rPr>
+          <w:rFonts w:ascii="Aptos Mono" w:hAnsi="Aptos Mono"/>
+          <w:sz w:val="20"/>
+          <w:szCs w:val="20"/>
+        </w:rPr>
+      </w:pPr>
+    </w:p>
+    <w:p>
+      <w:pPr>
+        <w:widowControl/>
+        <w:autoSpaceDE/>
+        <w:autoSpaceDN/>
+        <w:ind w:left="142"/>
+        <w:jc w:val="both"/>
+        <w:textAlignment w:val="baseline"/>
+        <w:rPr>
+          <w:rFonts w:ascii="Aptos Mono" w:hAnsi="Aptos Mono"/>
+          <w:sz w:val="20"/>
+          <w:szCs w:val="20"/>
+        </w:rPr>
+      </w:pPr>
+    </w:p>
+    <w:p>
+      <w:pPr>
+        <w:widowControl/>
+        <w:autoSpaceDE/>
+        <w:autoSpaceDN/>
+        <w:ind w:left="142"/>
+        <w:jc w:val="both"/>
+        <w:textAlignment w:val="baseline"/>
+        <w:rPr>
+          <w:rFonts w:ascii="Aptos Mono" w:hAnsi="Aptos Mono"/>
+          <w:sz w:val="20"/>
+          <w:szCs w:val="20"/>
+        </w:rPr>
+      </w:pPr>
+    </w:p>
+    <w:p>
+      <w:pPr>
+        <w:widowControl/>
+        <w:autoSpaceDE/>
+        <w:autoSpaceDN/>
+        <w:ind w:left="142"/>
+        <w:jc w:val="both"/>
+        <w:textAlignment w:val="baseline"/>
+        <w:rPr>
+          <w:rFonts w:ascii="Aptos Mono" w:hAnsi="Aptos Mono"/>
+          <w:sz w:val="20"/>
+          <w:szCs w:val="20"/>
+        </w:rPr>
+      </w:pPr>
+      <w:r>
+        <w:rPr>
+          <w:rFonts w:ascii="Aptos Mono" w:hAnsi="Aptos Mono"/>
+          <w:noProof/>
+          <w:sz w:val="20"/>
+          <w:szCs w:val="20"/>
+          <w:lang w:val="pt-BR"/>
+        </w:rPr>
+        <w:drawing>
+          <wp:anchor distT="0" distB="0" distL="114300" distR="114300" simplePos="0" relativeHeight="251659264" behindDoc="0" locked="0" layoutInCell="1" allowOverlap="1" wp14:anchorId="0D5CD027" wp14:editId="571268D0">
+            <wp:simplePos x="0" y="0"/>
+            <wp:positionH relativeFrom="column">
+              <wp:posOffset>4859655</wp:posOffset>
+            </wp:positionH>
+            <wp:positionV relativeFrom="paragraph">
+              <wp:posOffset>12700</wp:posOffset>
+            </wp:positionV>
+            <wp:extent cx="2279650" cy="3419475"/>
+            <wp:effectExtent l="0" t="0" r="6350" b="9525"/>
+            <wp:wrapThrough wrapText="bothSides">
+              <wp:wrapPolygon edited="0">
+                <wp:start x="0" y="0"/>
+                <wp:lineTo x="0" y="21540"/>
+                <wp:lineTo x="21480" y="21540"/>
+                <wp:lineTo x="21480" y="0"/>
+                <wp:lineTo x="0" y="0"/>
+              </wp:wrapPolygon>
+            </wp:wrapThrough>
+            <wp:docPr id="4" name="Imagem 4" descr="Uma imagem contendo Diagrama&#10;&#10;O conteúdo gerado por IA pode estar incorreto."/>
+            <wp:cNvGraphicFramePr>
+              <a:graphicFrameLocks xmlns:a="http://schemas.openxmlformats.org/drawingml/2006/main" noChangeAspect="1"/>
+            </wp:cNvGraphicFramePr>
+            <a:graphic xmlns:a="http://schemas.openxmlformats.org/drawingml/2006/main">
+              <a:graphicData uri="http://schemas.openxmlformats.org/drawingml/2006/picture">
+                <pic:pic xmlns:pic="http://schemas.openxmlformats.org/drawingml/2006/picture">
+                  <pic:nvPicPr>
+                    <pic:cNvPr id="4" name="Imagem 4" descr="Uma imagem contendo Diagrama&#10;&#10;O conteúdo gerado por IA pode estar incorreto."/>
+                    <pic:cNvPicPr/>
+                  </pic:nvPicPr>
+                  <pic:blipFill>
+                    <a:blip r:embed="rId9" cstate="print">
+                      <a:extLst>
+                        <a:ext uri="{28A0092B-C50C-407E-A947-70E740481C1C}">
+                          <a14:useLocalDpi xmlns:a14="http://schemas.microsoft.com/office/drawing/2010/main" val="0"/>
+                        </a:ext>
+                      </a:extLst>
+                    </a:blip>
+                    <a:stretch>
+                      <a:fillRect/>
+                    </a:stretch>
+                  </pic:blipFill>
+                  <pic:spPr>
+                    <a:xfrm>
+                      <a:off x="0" y="0"/>
+                      <a:ext cx="2279650" cy="3419475"/>
+                    </a:xfrm>
+                    <a:prstGeom prst="rect">
+                      <a:avLst/>
+                    </a:prstGeom>
+                  </pic:spPr>
+                </pic:pic>
+              </a:graphicData>
+            </a:graphic>
+          </wp:anchor>
+        </w:drawing>
+      </w:r>
+    </w:p>
+    <w:p>
+      <w:pPr>
+        <w:widowControl/>
+        <w:autoSpaceDE/>
+        <w:autoSpaceDN/>
+        <w:ind w:left="142"/>
+        <w:jc w:val="both"/>
+        <w:textAlignment w:val="baseline"/>
+        <w:rPr>
+          <w:rFonts w:ascii="Aptos Mono" w:hAnsi="Aptos Mono"/>
           <w:b/>
-          <w:sz w:val="24"/>
-          <w:szCs w:val="24"/>
+          <w:bCs/>
+          <w:sz w:val="20"/>
+          <w:szCs w:val="20"/>
+          <w:lang w:val="pt-BR"/>
         </w:rPr>
       </w:pPr>
       <w:r>
         <w:rPr>
           <w:rFonts w:ascii="Aptos Mono" w:hAnsi="Aptos Mono"/>
           <w:b/>
-          <w:sz w:val="24"/>
-          <w:szCs w:val="24"/>
-        </w:rPr>
-        <w:t>Execução</w:t>
+          <w:bCs/>
+          <w:sz w:val="20"/>
+          <w:szCs w:val="20"/>
+          <w:lang w:val="pt-BR"/>
+        </w:rPr>
+        <w:t>Desafio 2 – Fatoração e Simplificação</w:t>
       </w:r>
       <w:r>
         <w:rPr>
           <w:rFonts w:ascii="Aptos Mono" w:hAnsi="Aptos Mono"/>
           <w:b/>
-          <w:sz w:val="24"/>
-          <w:szCs w:val="24"/>
-        </w:rPr>
-        <w:t xml:space="preserve">: </w:t>
+          <w:bCs/>
+          <w:sz w:val="20"/>
+          <w:szCs w:val="20"/>
+          <w:lang w:val="pt-BR"/>
+        </w:rPr>
+        <w:t>:</w:t>
+      </w:r>
+    </w:p>
+    <w:p>
+      <w:pPr>
+        <w:widowControl/>
+        <w:autoSpaceDE/>
+        <w:autoSpaceDN/>
+        <w:textAlignment w:val="baseline"/>
+        <w:rPr>
+          <w:rFonts w:ascii="Aptos Mono" w:hAnsi="Aptos Mono"/>
+          <w:b/>
+          <w:bCs/>
+          <w:sz w:val="20"/>
+          <w:szCs w:val="20"/>
+          <w:lang w:val="pt-BR"/>
+        </w:rPr>
+      </w:pPr>
+    </w:p>
+    <w:p>
+      <w:pPr>
+        <w:widowControl/>
+        <w:autoSpaceDE/>
+        <w:autoSpaceDN/>
+        <w:ind w:left="142"/>
+        <w:textAlignment w:val="baseline"/>
+        <w:rPr>
+          <w:rFonts w:ascii="Aptos Mono" w:hAnsi="Aptos Mono"/>
+          <w:sz w:val="20"/>
+          <w:szCs w:val="20"/>
+          <w:lang w:val="pt-BR"/>
+        </w:rPr>
+      </w:pPr>
+      <w:r>
+        <w:rPr>
+          <w:rFonts w:ascii="Aptos Mono" w:hAnsi="Aptos Mono"/>
+          <w:b/>
+          <w:bCs/>
+          <w:sz w:val="20"/>
+          <w:szCs w:val="20"/>
+          <w:lang w:val="pt-BR"/>
+        </w:rPr>
+        <w:t>Contexto no jogo:</w:t>
       </w:r>
       <w:r>
         <w:rPr>
           <w:rFonts w:ascii="Aptos Mono" w:hAnsi="Aptos Mono"/>
           <w:sz w:val="20"/>
           <w:szCs w:val="20"/>
-        </w:rPr>
-        <w:t xml:space="preserve">Durante a gameplay do jogo quando a compra do computador for efetuada, aparecerá uma tela que ira pedir </w:t>
+          <w:lang w:val="pt-BR"/>
+        </w:rPr>
+        <w:br/>
+        <w:t>O jogador precisa otimizar um código para reduzir o custo de execução de um algoritmo automático.</w:t>
+      </w:r>
+    </w:p>
+    <w:p>
+      <w:pPr>
+        <w:widowControl/>
+        <w:autoSpaceDE/>
+        <w:autoSpaceDN/>
+        <w:ind w:left="142"/>
+        <w:jc w:val="both"/>
+        <w:textAlignment w:val="baseline"/>
+        <w:rPr>
+          <w:rFonts w:ascii="Aptos Mono" w:hAnsi="Aptos Mono"/>
+          <w:b/>
+          <w:bCs/>
+          <w:sz w:val="20"/>
+          <w:szCs w:val="20"/>
+          <w:lang w:val="pt-BR"/>
+        </w:rPr>
+      </w:pPr>
+    </w:p>
+    <w:p>
+      <w:pPr>
+        <w:widowControl/>
+        <w:autoSpaceDE/>
+        <w:autoSpaceDN/>
+        <w:ind w:left="142"/>
+        <w:jc w:val="both"/>
+        <w:textAlignment w:val="baseline"/>
+        <w:rPr>
+          <w:rFonts w:ascii="Aptos Mono" w:hAnsi="Aptos Mono"/>
+          <w:b/>
+          <w:bCs/>
+          <w:sz w:val="20"/>
+          <w:szCs w:val="20"/>
+          <w:lang w:val="pt-BR"/>
+        </w:rPr>
+      </w:pPr>
+    </w:p>
+    <w:p>
+      <w:pPr>
+        <w:widowControl/>
+        <w:autoSpaceDE/>
+        <w:autoSpaceDN/>
+        <w:ind w:left="142"/>
+        <w:jc w:val="both"/>
+        <w:textAlignment w:val="baseline"/>
+        <w:rPr>
+          <w:rFonts w:ascii="Aptos Mono" w:hAnsi="Aptos Mono"/>
+          <w:b/>
+          <w:bCs/>
+          <w:sz w:val="20"/>
+          <w:szCs w:val="20"/>
+          <w:lang w:val="pt-BR"/>
+        </w:rPr>
+      </w:pPr>
+    </w:p>
+    <w:p>
+      <w:pPr>
+        <w:widowControl/>
+        <w:autoSpaceDE/>
+        <w:autoSpaceDN/>
+        <w:ind w:left="142"/>
+        <w:jc w:val="both"/>
+        <w:textAlignment w:val="baseline"/>
+        <w:rPr>
+          <w:rFonts w:ascii="Aptos Mono" w:hAnsi="Aptos Mono"/>
+          <w:sz w:val="20"/>
+          <w:szCs w:val="20"/>
+          <w:lang w:val="pt-BR"/>
+        </w:rPr>
+      </w:pPr>
+      <w:r>
+        <w:rPr>
+          <w:rFonts w:ascii="Aptos Mono" w:hAnsi="Aptos Mono"/>
+          <w:b/>
+          <w:bCs/>
+          <w:sz w:val="20"/>
+          <w:szCs w:val="20"/>
+          <w:lang w:val="pt-BR"/>
+        </w:rPr>
+        <w:t>Enunciado:</w:t>
       </w:r>
       <w:r>
         <w:rPr>
           <w:rFonts w:ascii="Aptos Mono" w:hAnsi="Aptos Mono"/>
           <w:sz w:val="20"/>
           <w:szCs w:val="20"/>
-        </w:rPr>
-        <w:t xml:space="preserve">a resolução de um calculo apresentado na interface que ira seguir uma equação, onde </w:t>
+          <w:lang w:val="pt-BR"/>
+        </w:rPr>
+        <w:br/>
+        <w:t>Simplifique a expressão que representa o custo do algoritmo:</w:t>
       </w:r>
-      <w:bookmarkStart w:id="0" w:name="_GoBack"/>
-      <w:bookmarkEnd w:id="0"/>
-    </w:p>
-    <w:p>
-      <w:pPr>
-        <w:widowControl/>
-        <w:autoSpaceDE/>
-        <w:autoSpaceDN/>
-        <w:ind w:left="142"/>
-        <w:jc w:val="both"/>
-        <w:textAlignment w:val="baseline"/>
+    </w:p>
+    <w:p>
+      <w:pPr>
+        <w:widowControl/>
+        <w:autoSpaceDE/>
+        <w:autoSpaceDN/>
+        <w:ind w:left="142"/>
+        <w:jc w:val="both"/>
+        <w:textAlignment w:val="baseline"/>
+        <w:rPr>
+          <w:rFonts w:ascii="Aptos Mono" w:hAnsi="Aptos Mono"/>
+          <w:sz w:val="20"/>
+          <w:szCs w:val="20"/>
+          <w:lang w:val="pt-BR"/>
+        </w:rPr>
+      </w:pPr>
+    </w:p>
+    <w:p>
+      <w:pPr>
+        <w:widowControl/>
+        <w:autoSpaceDE/>
+        <w:autoSpaceDN/>
+        <w:ind w:left="142"/>
+        <w:jc w:val="both"/>
+        <w:textAlignment w:val="baseline"/>
+        <w:rPr>
+          <w:rFonts w:ascii="Aptos Mono" w:hAnsi="Aptos Mono"/>
+          <w:sz w:val="20"/>
+          <w:szCs w:val="20"/>
+          <w:lang w:val="pt-BR"/>
+        </w:rPr>
+      </w:pPr>
+    </w:p>
+    <w:p>
+      <w:pPr>
+        <w:widowControl/>
+        <w:autoSpaceDE/>
+        <w:autoSpaceDN/>
+        <w:ind w:left="142"/>
+        <w:jc w:val="both"/>
+        <w:textAlignment w:val="baseline"/>
+        <w:rPr>
+          <w:rFonts w:ascii="Aptos Mono" w:hAnsi="Aptos Mono"/>
+          <w:sz w:val="20"/>
+          <w:szCs w:val="20"/>
+          <w:lang w:val="pt-BR"/>
+        </w:rPr>
+      </w:pPr>
+    </w:p>
+    <w:p>
+      <w:pPr>
+        <w:widowControl/>
+        <w:autoSpaceDE/>
+        <w:autoSpaceDN/>
+        <w:ind w:left="142"/>
+        <w:textAlignment w:val="baseline"/>
+        <w:rPr>
+          <w:rFonts w:ascii="Aptos Mono" w:hAnsi="Aptos Mono"/>
+          <w:sz w:val="20"/>
+          <w:szCs w:val="20"/>
+          <w:lang w:val="pt-BR"/>
+        </w:rPr>
+      </w:pPr>
+      <w:r>
         <w:rPr>
           <w:rFonts w:ascii="Aptos Mono" w:hAnsi="Aptos Mono"/>
           <w:b/>
-          <w:sz w:val="24"/>
-          <w:szCs w:val="24"/>
+          <w:bCs/>
+          <w:sz w:val="20"/>
+          <w:szCs w:val="20"/>
+        </w:rPr>
+        <w:t>Como ajuda no jogo:</w:t>
+      </w:r>
+      <w:r>
+        <w:rPr>
+          <w:rFonts w:ascii="Aptos Mono" w:hAnsi="Aptos Mono"/>
+          <w:sz w:val="20"/>
+          <w:szCs w:val="20"/>
+        </w:rPr>
+        <w:br/>
+        <w:t>Ao simplificar corretamente, o jogador reduz o custo do algoritmo, aumentando a eficiência dos cliques automáticos.</w:t>
+      </w:r>
+    </w:p>
+    <w:p>
+      <w:pPr>
+        <w:widowControl/>
+        <w:autoSpaceDE/>
+        <w:autoSpaceDN/>
+        <w:ind w:left="142"/>
+        <w:jc w:val="both"/>
+        <w:textAlignment w:val="baseline"/>
+        <w:rPr>
+          <w:rFonts w:ascii="Aptos Mono" w:hAnsi="Aptos Mono"/>
+          <w:sz w:val="20"/>
+          <w:szCs w:val="20"/>
+          <w:lang w:val="pt-BR"/>
+        </w:rPr>
+      </w:pPr>
+    </w:p>
+    <w:p>
+      <w:pPr>
+        <w:widowControl/>
+        <w:autoSpaceDE/>
+        <w:autoSpaceDN/>
+        <w:ind w:left="142"/>
+        <w:jc w:val="both"/>
+        <w:textAlignment w:val="baseline"/>
+        <w:rPr>
+          <w:rFonts w:ascii="Aptos Mono" w:hAnsi="Aptos Mono"/>
+          <w:sz w:val="20"/>
+          <w:szCs w:val="20"/>
+        </w:rPr>
+      </w:pPr>
+    </w:p>
+    <w:p>
+      <w:pPr>
+        <w:widowControl/>
+        <w:autoSpaceDE/>
+        <w:autoSpaceDN/>
+        <w:ind w:left="142"/>
+        <w:jc w:val="both"/>
+        <w:textAlignment w:val="baseline"/>
+        <w:rPr>
+          <w:rFonts w:ascii="Aptos Mono" w:hAnsi="Aptos Mono"/>
+          <w:sz w:val="20"/>
+          <w:szCs w:val="20"/>
+        </w:rPr>
+      </w:pPr>
+    </w:p>
+    <w:p>
+      <w:pPr>
+        <w:widowControl/>
+        <w:autoSpaceDE/>
+        <w:autoSpaceDN/>
+        <w:ind w:left="142"/>
+        <w:jc w:val="both"/>
+        <w:textAlignment w:val="baseline"/>
+        <w:rPr>
+          <w:rFonts w:ascii="Aptos Mono" w:hAnsi="Aptos Mono"/>
+          <w:sz w:val="20"/>
+          <w:szCs w:val="20"/>
+        </w:rPr>
+      </w:pPr>
+    </w:p>
+    <w:p>
+      <w:pPr>
+        <w:widowControl/>
+        <w:autoSpaceDE/>
+        <w:autoSpaceDN/>
+        <w:ind w:left="142"/>
+        <w:jc w:val="both"/>
+        <w:textAlignment w:val="baseline"/>
+        <w:rPr>
+          <w:rFonts w:ascii="Aptos Mono" w:hAnsi="Aptos Mono"/>
+          <w:sz w:val="20"/>
+          <w:szCs w:val="20"/>
+        </w:rPr>
+      </w:pPr>
+    </w:p>
+    <w:p>
+      <w:pPr>
+        <w:widowControl/>
+        <w:autoSpaceDE/>
+        <w:autoSpaceDN/>
+        <w:ind w:left="142"/>
+        <w:jc w:val="both"/>
+        <w:textAlignment w:val="baseline"/>
+        <w:rPr>
+          <w:rFonts w:ascii="Aptos Mono" w:hAnsi="Aptos Mono"/>
+          <w:sz w:val="20"/>
+          <w:szCs w:val="20"/>
+        </w:rPr>
+      </w:pPr>
+    </w:p>
+    <w:p>
+      <w:pPr>
+        <w:widowControl/>
+        <w:autoSpaceDE/>
+        <w:autoSpaceDN/>
+        <w:ind w:left="142"/>
+        <w:jc w:val="both"/>
+        <w:textAlignment w:val="baseline"/>
+        <w:rPr>
+          <w:rFonts w:ascii="Aptos Mono" w:hAnsi="Aptos Mono"/>
+          <w:sz w:val="20"/>
+          <w:szCs w:val="20"/>
+        </w:rPr>
+      </w:pPr>
+    </w:p>
+    <w:p>
+      <w:pPr>
+        <w:widowControl/>
+        <w:autoSpaceDE/>
+        <w:autoSpaceDN/>
+        <w:ind w:left="142"/>
+        <w:jc w:val="both"/>
+        <w:textAlignment w:val="baseline"/>
+        <w:rPr>
+          <w:rFonts w:ascii="Aptos Mono" w:hAnsi="Aptos Mono"/>
+          <w:sz w:val="20"/>
+          <w:szCs w:val="20"/>
+        </w:rPr>
+      </w:pPr>
+      <w:r>
+        <w:rPr>
+          <w:rFonts w:ascii="Aptos Mono" w:hAnsi="Aptos Mono"/>
+          <w:noProof/>
+          <w:sz w:val="20"/>
+          <w:szCs w:val="20"/>
+        </w:rPr>
+        <w:drawing>
+          <wp:anchor distT="0" distB="0" distL="114300" distR="114300" simplePos="0" relativeHeight="251660288" behindDoc="0" locked="0" layoutInCell="1" allowOverlap="1" wp14:anchorId="69B7DAAC" wp14:editId="2D89DA11">
+            <wp:simplePos x="0" y="0"/>
+            <wp:positionH relativeFrom="column">
+              <wp:posOffset>4820920</wp:posOffset>
+            </wp:positionH>
+            <wp:positionV relativeFrom="paragraph">
+              <wp:posOffset>60960</wp:posOffset>
+            </wp:positionV>
+            <wp:extent cx="2295525" cy="3442970"/>
+            <wp:effectExtent l="0" t="0" r="9525" b="5080"/>
+            <wp:wrapThrough wrapText="bothSides">
+              <wp:wrapPolygon edited="0">
+                <wp:start x="0" y="0"/>
+                <wp:lineTo x="0" y="21512"/>
+                <wp:lineTo x="21510" y="21512"/>
+                <wp:lineTo x="21510" y="0"/>
+                <wp:lineTo x="0" y="0"/>
+              </wp:wrapPolygon>
+            </wp:wrapThrough>
+            <wp:docPr id="5" name="Imagem 5" descr="Uma imagem contendo Interface gráfica do usuário&#10;&#10;O conteúdo gerado por IA pode estar incorreto."/>
+            <wp:cNvGraphicFramePr>
+              <a:graphicFrameLocks xmlns:a="http://schemas.openxmlformats.org/drawingml/2006/main" noChangeAspect="1"/>
+            </wp:cNvGraphicFramePr>
+            <a:graphic xmlns:a="http://schemas.openxmlformats.org/drawingml/2006/main">
+              <a:graphicData uri="http://schemas.openxmlformats.org/drawingml/2006/picture">
+                <pic:pic xmlns:pic="http://schemas.openxmlformats.org/drawingml/2006/picture">
+                  <pic:nvPicPr>
+                    <pic:cNvPr id="5" name="Imagem 5" descr="Uma imagem contendo Interface gráfica do usuário&#10;&#10;O conteúdo gerado por IA pode estar incorreto."/>
+                    <pic:cNvPicPr/>
+                  </pic:nvPicPr>
+                  <pic:blipFill>
+                    <a:blip r:embed="rId10" cstate="print">
+                      <a:extLst>
+                        <a:ext uri="{28A0092B-C50C-407E-A947-70E740481C1C}">
+                          <a14:useLocalDpi xmlns:a14="http://schemas.microsoft.com/office/drawing/2010/main" val="0"/>
+                        </a:ext>
+                      </a:extLst>
+                    </a:blip>
+                    <a:stretch>
+                      <a:fillRect/>
+                    </a:stretch>
+                  </pic:blipFill>
+                  <pic:spPr>
+                    <a:xfrm>
+                      <a:off x="0" y="0"/>
+                      <a:ext cx="2295525" cy="3442970"/>
+                    </a:xfrm>
+                    <a:prstGeom prst="rect">
+                      <a:avLst/>
+                    </a:prstGeom>
+                  </pic:spPr>
+                </pic:pic>
+              </a:graphicData>
+            </a:graphic>
+            <wp14:sizeRelH relativeFrom="margin">
+              <wp14:pctWidth>0</wp14:pctWidth>
+            </wp14:sizeRelH>
+            <wp14:sizeRelV relativeFrom="margin">
+              <wp14:pctHeight>0</wp14:pctHeight>
+            </wp14:sizeRelV>
+          </wp:anchor>
+        </w:drawing>
+      </w:r>
+    </w:p>
+    <w:p>
+      <w:pPr>
+        <w:widowControl/>
+        <w:autoSpaceDE/>
+        <w:autoSpaceDN/>
+        <w:ind w:left="142"/>
+        <w:jc w:val="both"/>
+        <w:textAlignment w:val="baseline"/>
+        <w:rPr>
+          <w:rFonts w:ascii="Aptos Mono" w:hAnsi="Aptos Mono"/>
+          <w:sz w:val="20"/>
+          <w:szCs w:val="20"/>
+        </w:rPr>
+      </w:pPr>
+    </w:p>
+    <w:p>
+      <w:pPr>
+        <w:widowControl/>
+        <w:autoSpaceDE/>
+        <w:autoSpaceDN/>
+        <w:ind w:left="142"/>
+        <w:jc w:val="both"/>
+        <w:textAlignment w:val="baseline"/>
+        <w:rPr>
+          <w:rFonts w:ascii="Aptos Mono" w:hAnsi="Aptos Mono"/>
+          <w:b/>
+          <w:bCs/>
+          <w:sz w:val="20"/>
+          <w:szCs w:val="20"/>
+          <w:lang w:val="pt-BR"/>
+        </w:rPr>
+      </w:pPr>
+      <w:r>
+        <w:rPr>
+          <w:rFonts w:ascii="Aptos Mono" w:hAnsi="Aptos Mono"/>
+          <w:b/>
+          <w:bCs/>
+          <w:sz w:val="20"/>
+          <w:szCs w:val="20"/>
+          <w:lang w:val="pt-BR"/>
+        </w:rPr>
+        <w:t>Desafio 3 – Equações e Sistemas de Equações</w:t>
+      </w:r>
+    </w:p>
+    <w:p>
+      <w:pPr>
+        <w:widowControl/>
+        <w:autoSpaceDE/>
+        <w:autoSpaceDN/>
+        <w:ind w:left="142"/>
+        <w:textAlignment w:val="baseline"/>
+        <w:rPr>
+          <w:rFonts w:ascii="Aptos Mono" w:hAnsi="Aptos Mono"/>
+          <w:sz w:val="20"/>
+          <w:szCs w:val="20"/>
+          <w:lang w:val="pt-BR"/>
+        </w:rPr>
+      </w:pPr>
+      <w:r>
+        <w:rPr>
+          <w:rFonts w:ascii="Aptos Mono" w:hAnsi="Aptos Mono"/>
+          <w:b/>
+          <w:bCs/>
+          <w:sz w:val="20"/>
+          <w:szCs w:val="20"/>
+          <w:lang w:val="pt-BR"/>
+        </w:rPr>
+        <w:t>Contexto no jogo:</w:t>
+      </w:r>
+      <w:r>
+        <w:rPr>
+          <w:rFonts w:ascii="Aptos Mono" w:hAnsi="Aptos Mono"/>
+          <w:sz w:val="20"/>
+          <w:szCs w:val="20"/>
+          <w:lang w:val="pt-BR"/>
+        </w:rPr>
+        <w:br/>
+        <w:t>O jogador precisa configurar corretamente um sistema de automação que combina dois tipos de scripts para gerar renda.</w:t>
+      </w:r>
+    </w:p>
+    <w:p>
+      <w:pPr>
+        <w:widowControl/>
+        <w:autoSpaceDE/>
+        <w:autoSpaceDN/>
+        <w:ind w:left="142"/>
+        <w:textAlignment w:val="baseline"/>
+        <w:rPr>
+          <w:rFonts w:ascii="Aptos Mono" w:hAnsi="Aptos Mono"/>
+          <w:sz w:val="20"/>
+          <w:szCs w:val="20"/>
+          <w:lang w:val="pt-BR"/>
+        </w:rPr>
+      </w:pPr>
+    </w:p>
+    <w:p>
+      <w:pPr>
+        <w:widowControl/>
+        <w:autoSpaceDE/>
+        <w:autoSpaceDN/>
+        <w:ind w:left="142"/>
+        <w:textAlignment w:val="baseline"/>
+        <w:rPr>
+          <w:rFonts w:ascii="Aptos Mono" w:hAnsi="Aptos Mono"/>
+          <w:sz w:val="20"/>
+          <w:szCs w:val="20"/>
+          <w:lang w:val="pt-BR"/>
+        </w:rPr>
+      </w:pPr>
+    </w:p>
+    <w:p>
+      <w:pPr>
+        <w:widowControl/>
+        <w:autoSpaceDE/>
+        <w:autoSpaceDN/>
+        <w:ind w:left="142"/>
+        <w:jc w:val="both"/>
+        <w:textAlignment w:val="baseline"/>
+        <w:rPr>
+          <w:rFonts w:ascii="Aptos Mono" w:hAnsi="Aptos Mono"/>
+          <w:sz w:val="20"/>
+          <w:szCs w:val="20"/>
+          <w:lang w:val="pt-BR"/>
+        </w:rPr>
+      </w:pPr>
+      <w:r>
+        <w:rPr>
+          <w:rFonts w:ascii="Aptos Mono" w:hAnsi="Aptos Mono"/>
+          <w:b/>
+          <w:bCs/>
+          <w:sz w:val="20"/>
+          <w:szCs w:val="20"/>
+          <w:lang w:val="pt-BR"/>
+        </w:rPr>
+        <w:t>Enunciado:</w:t>
+      </w:r>
+      <w:r>
+        <w:rPr>
+          <w:rFonts w:ascii="Aptos Mono" w:hAnsi="Aptos Mono"/>
+          <w:sz w:val="20"/>
+          <w:szCs w:val="20"/>
+          <w:lang w:val="pt-BR"/>
+        </w:rPr>
+        <w:br/>
+        <w:t>Um sistema usa dois scripts:</w:t>
+      </w:r>
+    </w:p>
+    <w:p>
+      <w:pPr>
+        <w:widowControl/>
+        <w:numPr>
+          <w:ilvl w:val="0"/>
+          <w:numId w:val="30"/>
+        </w:numPr>
+        <w:autoSpaceDE/>
+        <w:autoSpaceDN/>
+        <w:jc w:val="both"/>
+        <w:textAlignment w:val="baseline"/>
+        <w:rPr>
+          <w:rFonts w:ascii="Aptos Mono" w:hAnsi="Aptos Mono"/>
+          <w:sz w:val="20"/>
+          <w:szCs w:val="20"/>
+          <w:lang w:val="pt-BR"/>
+        </w:rPr>
+      </w:pPr>
+      <w:r>
+        <w:rPr>
+          <w:rFonts w:ascii="Aptos Mono" w:hAnsi="Aptos Mono"/>
+          <w:sz w:val="20"/>
+          <w:szCs w:val="20"/>
+          <w:lang w:val="pt-BR"/>
+        </w:rPr>
+        <w:t>Script A gera 5 moedas por segundo;</w:t>
+      </w:r>
+    </w:p>
+    <w:p>
+      <w:pPr>
+        <w:widowControl/>
+        <w:numPr>
+          <w:ilvl w:val="0"/>
+          <w:numId w:val="30"/>
+        </w:numPr>
+        <w:autoSpaceDE/>
+        <w:autoSpaceDN/>
+        <w:jc w:val="both"/>
+        <w:textAlignment w:val="baseline"/>
+        <w:rPr>
+          <w:rFonts w:ascii="Aptos Mono" w:hAnsi="Aptos Mono"/>
+          <w:sz w:val="20"/>
+          <w:szCs w:val="20"/>
+          <w:lang w:val="pt-BR"/>
+        </w:rPr>
+      </w:pPr>
+      <w:r>
+        <w:rPr>
+          <w:rFonts w:ascii="Aptos Mono" w:hAnsi="Aptos Mono"/>
+          <w:sz w:val="20"/>
+          <w:szCs w:val="20"/>
+          <w:lang w:val="pt-BR"/>
+        </w:rPr>
+        <w:t>Script B gera 3 moedas por segundo.</w:t>
+      </w:r>
+    </w:p>
+    <w:p>
+      <w:pPr>
+        <w:widowControl/>
+        <w:autoSpaceDE/>
+        <w:autoSpaceDN/>
+        <w:ind w:left="142"/>
+        <w:jc w:val="both"/>
+        <w:textAlignment w:val="baseline"/>
+        <w:rPr>
+          <w:rFonts w:ascii="Aptos Mono" w:hAnsi="Aptos Mono"/>
+          <w:sz w:val="20"/>
+          <w:szCs w:val="20"/>
+          <w:lang w:val="pt-BR"/>
+        </w:rPr>
+      </w:pPr>
+      <w:r>
+        <w:rPr>
+          <w:rFonts w:ascii="Aptos Mono" w:hAnsi="Aptos Mono"/>
+          <w:sz w:val="20"/>
+          <w:szCs w:val="20"/>
+          <w:lang w:val="pt-BR"/>
+        </w:rPr>
+        <w:t>Juntos, eles geram 29 moedas por segundo. Sabendo que o total de scripts usados é 7, quantos scripts de cada tipo estão ativos?</w:t>
+      </w:r>
+    </w:p>
+    <w:p>
+      <w:pPr>
+        <w:widowControl/>
+        <w:autoSpaceDE/>
+        <w:autoSpaceDN/>
+        <w:ind w:left="142"/>
+        <w:jc w:val="both"/>
+        <w:textAlignment w:val="baseline"/>
+        <w:rPr>
+          <w:rFonts w:ascii="Aptos Mono" w:hAnsi="Aptos Mono"/>
+          <w:sz w:val="20"/>
+          <w:szCs w:val="20"/>
+        </w:rPr>
+      </w:pPr>
+    </w:p>
+    <w:p>
+      <w:pPr>
+        <w:widowControl/>
+        <w:autoSpaceDE/>
+        <w:autoSpaceDN/>
+        <w:ind w:left="142"/>
+        <w:jc w:val="both"/>
+        <w:textAlignment w:val="baseline"/>
+        <w:rPr>
+          <w:rFonts w:ascii="Aptos Mono" w:hAnsi="Aptos Mono"/>
+          <w:sz w:val="20"/>
+          <w:szCs w:val="20"/>
+        </w:rPr>
+      </w:pPr>
+    </w:p>
+    <w:p>
+      <w:pPr>
+        <w:widowControl/>
+        <w:autoSpaceDE/>
+        <w:autoSpaceDN/>
+        <w:ind w:left="142"/>
+        <w:textAlignment w:val="baseline"/>
+        <w:rPr>
+          <w:rFonts w:ascii="Aptos Mono" w:hAnsi="Aptos Mono"/>
+          <w:sz w:val="20"/>
+          <w:szCs w:val="20"/>
+          <w:lang w:val="pt-BR"/>
+        </w:rPr>
+      </w:pPr>
+      <w:r>
+        <w:rPr>
+          <w:rFonts w:ascii="Aptos Mono" w:hAnsi="Aptos Mono"/>
+          <w:b/>
+          <w:bCs/>
+          <w:sz w:val="20"/>
+          <w:szCs w:val="20"/>
+          <w:lang w:val="pt-BR"/>
+        </w:rPr>
+        <w:t>Como ajuda no jogo:</w:t>
+      </w:r>
+      <w:r>
+        <w:rPr>
+          <w:rFonts w:ascii="Aptos Mono" w:hAnsi="Aptos Mono"/>
+          <w:sz w:val="20"/>
+          <w:szCs w:val="20"/>
+          <w:lang w:val="pt-BR"/>
+        </w:rPr>
+        <w:br/>
+        <w:t xml:space="preserve">O </w:t>
+      </w:r>
+      <w:r>
+        <w:rPr>
+          <w:rFonts w:ascii="Aptos Mono" w:hAnsi="Aptos Mono"/>
+          <w:sz w:val="20"/>
+          <w:szCs w:val="20"/>
+          <w:lang w:val="pt-BR"/>
+        </w:rPr>
+        <w:t>jogador ativo</w:t>
+      </w:r>
+      <w:r>
+        <w:rPr>
+          <w:rFonts w:ascii="Aptos Mono" w:hAnsi="Aptos Mono"/>
+          <w:sz w:val="20"/>
+          <w:szCs w:val="20"/>
+          <w:lang w:val="pt-BR"/>
+        </w:rPr>
+        <w:t xml:space="preserve"> corretamente o sistema de automação, aumentando sua produção de dinheiro passivo.</w:t>
+      </w:r>
+    </w:p>
+    <w:p>
+      <w:pPr>
+        <w:widowControl/>
+        <w:autoSpaceDE/>
+        <w:autoSpaceDN/>
+        <w:ind w:left="142"/>
+        <w:jc w:val="both"/>
+        <w:textAlignment w:val="baseline"/>
+        <w:rPr>
+          <w:rFonts w:ascii="Aptos Mono" w:hAnsi="Aptos Mono"/>
+          <w:sz w:val="20"/>
+          <w:szCs w:val="20"/>
+        </w:rPr>
+      </w:pPr>
+    </w:p>
+    <w:p>
+      <w:pPr>
+        <w:widowControl/>
+        <w:autoSpaceDE/>
+        <w:autoSpaceDN/>
+        <w:ind w:left="142"/>
+        <w:jc w:val="both"/>
+        <w:textAlignment w:val="baseline"/>
+        <w:rPr>
+          <w:rFonts w:ascii="Aptos Mono" w:hAnsi="Aptos Mono"/>
+          <w:sz w:val="20"/>
+          <w:szCs w:val="20"/>
+        </w:rPr>
+      </w:pPr>
+    </w:p>
+    <w:p>
+      <w:pPr>
+        <w:widowControl/>
+        <w:autoSpaceDE/>
+        <w:autoSpaceDN/>
+        <w:ind w:left="142"/>
+        <w:jc w:val="both"/>
+        <w:textAlignment w:val="baseline"/>
+        <w:rPr>
+          <w:rFonts w:ascii="Aptos Mono" w:hAnsi="Aptos Mono"/>
+          <w:sz w:val="20"/>
+          <w:szCs w:val="20"/>
+        </w:rPr>
+      </w:pPr>
+    </w:p>
+    <w:p>
+      <w:pPr>
+        <w:widowControl/>
+        <w:autoSpaceDE/>
+        <w:autoSpaceDN/>
+        <w:ind w:left="142"/>
+        <w:jc w:val="both"/>
+        <w:textAlignment w:val="baseline"/>
+        <w:rPr>
+          <w:rFonts w:ascii="Aptos Mono" w:hAnsi="Aptos Mono"/>
+          <w:sz w:val="20"/>
+          <w:szCs w:val="20"/>
+        </w:rPr>
+      </w:pPr>
+    </w:p>
+    <w:p>
+      <w:pPr>
+        <w:widowControl/>
+        <w:autoSpaceDE/>
+        <w:autoSpaceDN/>
+        <w:ind w:left="142"/>
+        <w:jc w:val="both"/>
+        <w:textAlignment w:val="baseline"/>
+        <w:rPr>
+          <w:rFonts w:ascii="Aptos Mono" w:hAnsi="Aptos Mono"/>
+          <w:sz w:val="20"/>
+          <w:szCs w:val="20"/>
+        </w:rPr>
+      </w:pPr>
+    </w:p>
+    <w:p>
+      <w:pPr>
+        <w:widowControl/>
+        <w:autoSpaceDE/>
+        <w:autoSpaceDN/>
+        <w:ind w:left="142"/>
+        <w:jc w:val="both"/>
+        <w:textAlignment w:val="baseline"/>
+        <w:rPr>
+          <w:rFonts w:ascii="Aptos Mono" w:hAnsi="Aptos Mono"/>
+          <w:sz w:val="20"/>
+          <w:szCs w:val="20"/>
+        </w:rPr>
+      </w:pPr>
+    </w:p>
+    <w:p>
+      <w:pPr>
+        <w:widowControl/>
+        <w:autoSpaceDE/>
+        <w:autoSpaceDN/>
+        <w:ind w:left="142"/>
+        <w:jc w:val="both"/>
+        <w:textAlignment w:val="baseline"/>
+        <w:rPr>
+          <w:rFonts w:ascii="Aptos Mono" w:hAnsi="Aptos Mono"/>
+          <w:sz w:val="20"/>
+          <w:szCs w:val="20"/>
+        </w:rPr>
+      </w:pPr>
+    </w:p>
+    <w:p>
+      <w:pPr>
+        <w:widowControl/>
+        <w:autoSpaceDE/>
+        <w:autoSpaceDN/>
+        <w:ind w:left="142"/>
+        <w:jc w:val="both"/>
+        <w:textAlignment w:val="baseline"/>
+        <w:rPr>
+          <w:rFonts w:ascii="Aptos Mono" w:hAnsi="Aptos Mono"/>
+          <w:sz w:val="20"/>
+          <w:szCs w:val="20"/>
+        </w:rPr>
+      </w:pPr>
+    </w:p>
+    <w:p>
+      <w:pPr>
+        <w:widowControl/>
+        <w:autoSpaceDE/>
+        <w:autoSpaceDN/>
+        <w:ind w:left="142"/>
+        <w:jc w:val="both"/>
+        <w:textAlignment w:val="baseline"/>
+        <w:rPr>
+          <w:rFonts w:ascii="Aptos Mono" w:hAnsi="Aptos Mono"/>
+          <w:sz w:val="20"/>
+          <w:szCs w:val="20"/>
+        </w:rPr>
+      </w:pPr>
+    </w:p>
+    <w:p>
+      <w:pPr>
+        <w:widowControl/>
+        <w:autoSpaceDE/>
+        <w:autoSpaceDN/>
+        <w:ind w:left="142"/>
+        <w:jc w:val="both"/>
+        <w:textAlignment w:val="baseline"/>
+        <w:rPr>
+          <w:rFonts w:ascii="Aptos Mono" w:hAnsi="Aptos Mono"/>
+          <w:sz w:val="20"/>
+          <w:szCs w:val="20"/>
+        </w:rPr>
+      </w:pPr>
+    </w:p>
+    <w:p>
+      <w:pPr>
+        <w:widowControl/>
+        <w:autoSpaceDE/>
+        <w:autoSpaceDN/>
+        <w:ind w:left="142"/>
+        <w:jc w:val="both"/>
+        <w:textAlignment w:val="baseline"/>
+        <w:rPr>
+          <w:rFonts w:ascii="Aptos Mono" w:hAnsi="Aptos Mono"/>
+          <w:sz w:val="20"/>
+          <w:szCs w:val="20"/>
+        </w:rPr>
+      </w:pPr>
+    </w:p>
+    <w:p>
+      <w:pPr>
+        <w:widowControl/>
+        <w:autoSpaceDE/>
+        <w:autoSpaceDN/>
+        <w:ind w:left="142"/>
+        <w:jc w:val="both"/>
+        <w:textAlignment w:val="baseline"/>
+        <w:rPr>
+          <w:rFonts w:ascii="Aptos Mono" w:hAnsi="Aptos Mono"/>
+          <w:sz w:val="20"/>
+          <w:szCs w:val="20"/>
+        </w:rPr>
+      </w:pPr>
+    </w:p>
+    <w:p>
+      <w:pPr>
+        <w:widowControl/>
+        <w:autoSpaceDE/>
+        <w:autoSpaceDN/>
+        <w:ind w:left="142"/>
+        <w:jc w:val="both"/>
+        <w:textAlignment w:val="baseline"/>
+        <w:rPr>
+          <w:rFonts w:ascii="Aptos Mono" w:hAnsi="Aptos Mono"/>
+          <w:sz w:val="20"/>
+          <w:szCs w:val="20"/>
+        </w:rPr>
+      </w:pPr>
+    </w:p>
+    <w:p>
+      <w:pPr>
+        <w:widowControl/>
+        <w:autoSpaceDE/>
+        <w:autoSpaceDN/>
+        <w:ind w:left="142"/>
+        <w:jc w:val="both"/>
+        <w:textAlignment w:val="baseline"/>
+        <w:rPr>
+          <w:rFonts w:ascii="Aptos Mono" w:hAnsi="Aptos Mono"/>
+          <w:sz w:val="20"/>
+          <w:szCs w:val="20"/>
+        </w:rPr>
+      </w:pPr>
+    </w:p>
+    <w:p>
+      <w:pPr>
+        <w:widowControl/>
+        <w:autoSpaceDE/>
+        <w:autoSpaceDN/>
+        <w:ind w:left="142"/>
+        <w:jc w:val="both"/>
+        <w:textAlignment w:val="baseline"/>
+        <w:rPr>
+          <w:rFonts w:ascii="Aptos Mono" w:hAnsi="Aptos Mono"/>
+          <w:sz w:val="20"/>
+          <w:szCs w:val="20"/>
+        </w:rPr>
+      </w:pPr>
+    </w:p>
+    <w:p>
+      <w:pPr>
+        <w:widowControl/>
+        <w:autoSpaceDE/>
+        <w:autoSpaceDN/>
+        <w:ind w:left="142"/>
+        <w:jc w:val="both"/>
+        <w:textAlignment w:val="baseline"/>
+        <w:rPr>
+          <w:rFonts w:ascii="Aptos Mono" w:hAnsi="Aptos Mono"/>
+          <w:b/>
+          <w:bCs/>
+          <w:sz w:val="20"/>
+          <w:szCs w:val="20"/>
+          <w:lang w:val="pt-BR"/>
+        </w:rPr>
+      </w:pPr>
+      <w:r>
+        <w:rPr>
+          <w:rFonts w:ascii="Aptos Mono" w:hAnsi="Aptos Mono"/>
+          <w:b/>
+          <w:bCs/>
+          <w:sz w:val="20"/>
+          <w:szCs w:val="20"/>
+          <w:lang w:val="pt-BR"/>
+        </w:rPr>
+        <w:t>Conclusão</w:t>
+      </w:r>
+      <w:r>
+        <w:rPr>
+          <w:rFonts w:ascii="Aptos Mono" w:hAnsi="Aptos Mono"/>
+          <w:b/>
+          <w:bCs/>
+          <w:sz w:val="20"/>
+          <w:szCs w:val="20"/>
+          <w:lang w:val="pt-BR"/>
+        </w:rPr>
+        <w:t>:</w:t>
+      </w:r>
+    </w:p>
+    <w:p>
+      <w:pPr>
+        <w:widowControl/>
+        <w:autoSpaceDE/>
+        <w:autoSpaceDN/>
+        <w:ind w:left="142"/>
+        <w:jc w:val="both"/>
+        <w:textAlignment w:val="baseline"/>
+        <w:rPr>
+          <w:rFonts w:ascii="Aptos Mono" w:hAnsi="Aptos Mono"/>
+          <w:b/>
+          <w:bCs/>
+          <w:sz w:val="20"/>
+          <w:szCs w:val="20"/>
+          <w:lang w:val="pt-BR"/>
+        </w:rPr>
+      </w:pPr>
+    </w:p>
+    <w:p>
+      <w:pPr>
+        <w:widowControl/>
+        <w:autoSpaceDE/>
+        <w:autoSpaceDN/>
+        <w:ind w:left="142"/>
+        <w:jc w:val="both"/>
+        <w:textAlignment w:val="baseline"/>
+        <w:rPr>
+          <w:rFonts w:ascii="Aptos Mono" w:hAnsi="Aptos Mono"/>
+          <w:sz w:val="20"/>
+          <w:szCs w:val="20"/>
+          <w:lang w:val="pt-BR"/>
+        </w:rPr>
+      </w:pPr>
+      <w:r>
+        <w:rPr>
+          <w:rFonts w:ascii="Aptos Mono" w:hAnsi="Aptos Mono"/>
+          <w:sz w:val="20"/>
+          <w:szCs w:val="20"/>
+          <w:lang w:val="pt-BR"/>
+        </w:rPr>
+        <w:t>A matemática contribui diretamente para enriquecer a experiência do jogo, tornando-o mais estratégico e educativo. Ao inserir desafios matemáticos no contexto do gameplay, o jogador não apenas progride no jogo, mas também desenvolve raciocínio lógico e habilidades de resolução de problemas.</w:t>
+      </w:r>
+    </w:p>
+    <w:p>
+      <w:pPr>
+        <w:widowControl/>
+        <w:autoSpaceDE/>
+        <w:autoSpaceDN/>
+        <w:ind w:left="142"/>
+        <w:jc w:val="both"/>
+        <w:textAlignment w:val="baseline"/>
+        <w:rPr>
+          <w:rFonts w:ascii="Aptos Mono" w:hAnsi="Aptos Mono"/>
+          <w:sz w:val="20"/>
+          <w:szCs w:val="20"/>
+          <w:lang w:val="pt-BR"/>
+        </w:rPr>
+      </w:pPr>
+    </w:p>
+    <w:p>
+      <w:pPr>
+        <w:widowControl/>
+        <w:autoSpaceDE/>
+        <w:autoSpaceDN/>
+        <w:ind w:left="142"/>
+        <w:jc w:val="both"/>
+        <w:textAlignment w:val="baseline"/>
+        <w:rPr>
+          <w:rFonts w:ascii="Aptos Mono" w:hAnsi="Aptos Mono"/>
+          <w:sz w:val="20"/>
+          <w:szCs w:val="20"/>
+          <w:lang w:val="pt-BR"/>
+        </w:rPr>
+      </w:pPr>
+      <w:r>
+        <w:rPr>
+          <w:rFonts w:ascii="Aptos Mono" w:hAnsi="Aptos Mono"/>
+          <w:sz w:val="20"/>
+          <w:szCs w:val="20"/>
+          <w:lang w:val="pt-BR"/>
+        </w:rPr>
+        <w:t>Além disso, conceitos como potenciação, fatoração e sistemas de equações ajudam a simular situações reais da área de tecnologia, como otimização de código, cálculo de desempenho e tomada de decisões. Dessa forma, o jogo se torna não apenas entretenimento, mas também uma ferramenta de aprendizado integrada à temática de desenvolvimento.</w:t>
+      </w:r>
+    </w:p>
+    <w:p>
+      <w:pPr>
+        <w:widowControl/>
+        <w:autoSpaceDE/>
+        <w:autoSpaceDN/>
+        <w:ind w:left="142"/>
+        <w:jc w:val="both"/>
+        <w:textAlignment w:val="baseline"/>
+        <w:rPr>
+          <w:rFonts w:ascii="Aptos Mono" w:hAnsi="Aptos Mono"/>
+          <w:sz w:val="20"/>
+          <w:szCs w:val="20"/>
         </w:rPr>
       </w:pPr>
     </w:p>
     <w:sectPr>
-      <w:headerReference w:type="default" r:id="rId8"/>
-      <w:footerReference w:type="default" r:id="rId9"/>
+      <w:headerReference w:type="default" r:id="rId11"/>
+      <w:footerReference w:type="default" r:id="rId12"/>
       <w:type w:val="continuous"/>
       <w:pgSz w:w="11910" w:h="16850"/>
       <w:pgMar w:top="280" w:right="570" w:bottom="940" w:left="567" w:header="720" w:footer="181" w:gutter="0"/>
@@ -806,7 +2570,7 @@
 </file>
 
 <file path=word/endnotes.xml><?xml version="1.0" encoding="utf-8"?>
-<w:endnotes xmlns:wpc="http://schemas.microsoft.com/office/word/2010/wordprocessingCanvas" xmlns:cx="http://schemas.microsoft.com/office/drawing/2014/chartex" xmlns:cx1="http://schemas.microsoft.com/office/drawing/2015/9/8/chartex" xmlns:cx2="http://schemas.microsoft.com/office/drawing/2015/10/21/chartex" xmlns:cx3="http://schemas.microsoft.com/office/drawing/2016/5/9/chartex" xmlns:cx4="http://schemas.microsoft.com/office/drawing/2016/5/10/chartex" xmlns:cx5="http://schemas.microsoft.com/office/drawing/2016/5/11/chartex" xmlns:cx6="http://schemas.microsoft.com/office/drawing/2016/5/12/chartex" xmlns:cx7="http://schemas.microsoft.com/office/drawing/2016/5/13/chartex" xmlns:cx8="http://schemas.microsoft.com/office/drawing/2016/5/14/chartex" xmlns:mc="http://schemas.openxmlformats.org/markup-compatibility/2006" xmlns:aink="http://schemas.microsoft.com/office/drawing/2016/ink" xmlns:am3d="http://schemas.microsoft.com/office/drawing/2017/model3d" xmlns:o="urn:schemas-microsoft-com:office:office" xmlns:r="http://schemas.openxmlformats.org/officeDocument/2006/relationships" xmlns:m="http://schemas.openxmlformats.org/officeDocument/2006/math" xmlns:v="urn:schemas-microsoft-com:vml" xmlns:wp14="http://schemas.microsoft.com/office/word/2010/wordprocessingDrawing" xmlns:wp="http://schemas.openxmlformats.org/drawingml/2006/wordprocessingDrawing" xmlns:w10="urn:schemas-microsoft-com:office:word" xmlns:w="http://schemas.openxmlformats.org/wordprocessingml/2006/main" xmlns:w14="http://schemas.microsoft.com/office/word/2010/wordml" xmlns:w15="http://schemas.microsoft.com/office/word/2012/wordml" xmlns:w16cid="http://schemas.microsoft.com/office/word/2016/wordml/cid" xmlns:w16se="http://schemas.microsoft.com/office/word/2015/wordml/symex" xmlns:wpg="http://schemas.microsoft.com/office/word/2010/wordprocessingGroup" xmlns:wpi="http://schemas.microsoft.com/office/word/2010/wordprocessingInk" xmlns:wne="http://schemas.microsoft.com/office/word/2006/wordml" xmlns:wps="http://schemas.microsoft.com/office/word/2010/wordprocessingShape" mc:Ignorable="w14 w15 w16se w16cid wp14">
+<w:endnotes xmlns:wpc="http://schemas.microsoft.com/office/word/2010/wordprocessingCanvas" xmlns:cx="http://schemas.microsoft.com/office/drawing/2014/chartex" xmlns:cx1="http://schemas.microsoft.com/office/drawing/2015/9/8/chartex" xmlns:cx2="http://schemas.microsoft.com/office/drawing/2015/10/21/chartex" xmlns:cx3="http://schemas.microsoft.com/office/drawing/2016/5/9/chartex" xmlns:cx4="http://schemas.microsoft.com/office/drawing/2016/5/10/chartex" xmlns:cx5="http://schemas.microsoft.com/office/drawing/2016/5/11/chartex" xmlns:cx6="http://schemas.microsoft.com/office/drawing/2016/5/12/chartex" xmlns:cx7="http://schemas.microsoft.com/office/drawing/2016/5/13/chartex" xmlns:cx8="http://schemas.microsoft.com/office/drawing/2016/5/14/chartex" xmlns:mc="http://schemas.openxmlformats.org/markup-compatibility/2006" xmlns:aink="http://schemas.microsoft.com/office/drawing/2016/ink" xmlns:am3d="http://schemas.microsoft.com/office/drawing/2017/model3d" xmlns:o="urn:schemas-microsoft-com:office:office" xmlns:oel="http://schemas.microsoft.com/office/2019/extlst" xmlns:r="http://schemas.openxmlformats.org/officeDocument/2006/relationships" xmlns:m="http://schemas.openxmlformats.org/officeDocument/2006/math" xmlns:v="urn:schemas-microsoft-com:vml" xmlns:wp14="http://schemas.microsoft.com/office/word/2010/wordprocessingDrawing" xmlns:wp="http://schemas.openxmlformats.org/drawingml/2006/wordprocessingDrawing" xmlns:w10="urn:schemas-microsoft-com:office:word" xmlns:w="http://schemas.openxmlformats.org/wordprocessingml/2006/main" xmlns:w14="http://schemas.microsoft.com/office/word/2010/wordml" xmlns:w15="http://schemas.microsoft.com/office/word/2012/wordml" xmlns:w16cex="http://schemas.microsoft.com/office/word/2018/wordml/cex" xmlns:w16cid="http://schemas.microsoft.com/office/word/2016/wordml/cid" xmlns:w16="http://schemas.microsoft.com/office/word/2018/wordml" xmlns:w16sdtdh="http://schemas.microsoft.com/office/word/2020/wordml/sdtdatahash" xmlns:w16se="http://schemas.microsoft.com/office/word/2015/wordml/symex" xmlns:wpg="http://schemas.microsoft.com/office/word/2010/wordprocessingGroup" xmlns:wpi="http://schemas.microsoft.com/office/word/2010/wordprocessingInk" xmlns:wne="http://schemas.microsoft.com/office/word/2006/wordml" xmlns:wps="http://schemas.microsoft.com/office/word/2010/wordprocessingShape" mc:Ignorable="w14 w15 w16se w16cid w16 w16cex w16sdtdh wp14">
   <w:endnote w:type="separator" w:id="-1">
     <w:p>
       <w:r>
@@ -825,7 +2589,7 @@
 </file>
 
 <file path=word/footer1.xml><?xml version="1.0" encoding="utf-8"?>
-<w:ftr xmlns:wpc="http://schemas.microsoft.com/office/word/2010/wordprocessingCanvas" xmlns:cx="http://schemas.microsoft.com/office/drawing/2014/chartex" xmlns:cx1="http://schemas.microsoft.com/office/drawing/2015/9/8/chartex" xmlns:cx2="http://schemas.microsoft.com/office/drawing/2015/10/21/chartex" xmlns:cx3="http://schemas.microsoft.com/office/drawing/2016/5/9/chartex" xmlns:cx4="http://schemas.microsoft.com/office/drawing/2016/5/10/chartex" xmlns:cx5="http://schemas.microsoft.com/office/drawing/2016/5/11/chartex" xmlns:cx6="http://schemas.microsoft.com/office/drawing/2016/5/12/chartex" xmlns:cx7="http://schemas.microsoft.com/office/drawing/2016/5/13/chartex" xmlns:cx8="http://schemas.microsoft.com/office/drawing/2016/5/14/chartex" xmlns:mc="http://schemas.openxmlformats.org/markup-compatibility/2006" xmlns:aink="http://schemas.microsoft.com/office/drawing/2016/ink" xmlns:am3d="http://schemas.microsoft.com/office/drawing/2017/model3d" xmlns:o="urn:schemas-microsoft-com:office:office" xmlns:r="http://schemas.openxmlformats.org/officeDocument/2006/relationships" xmlns:m="http://schemas.openxmlformats.org/officeDocument/2006/math" xmlns:v="urn:schemas-microsoft-com:vml" xmlns:wp14="http://schemas.microsoft.com/office/word/2010/wordprocessingDrawing" xmlns:wp="http://schemas.openxmlformats.org/drawingml/2006/wordprocessingDrawing" xmlns:w10="urn:schemas-microsoft-com:office:word" xmlns:w="http://schemas.openxmlformats.org/wordprocessingml/2006/main" xmlns:w14="http://schemas.microsoft.com/office/word/2010/wordml" xmlns:w15="http://schemas.microsoft.com/office/word/2012/wordml" xmlns:w16cid="http://schemas.microsoft.com/office/word/2016/wordml/cid" xmlns:w16se="http://schemas.microsoft.com/office/word/2015/wordml/symex" xmlns:wpg="http://schemas.microsoft.com/office/word/2010/wordprocessingGroup" xmlns:wpi="http://schemas.microsoft.com/office/word/2010/wordprocessingInk" xmlns:wne="http://schemas.microsoft.com/office/word/2006/wordml" xmlns:wps="http://schemas.microsoft.com/office/word/2010/wordprocessingShape" mc:Ignorable="w14 w15 w16se w16cid wp14">
+<w:ftr xmlns:wpc="http://schemas.microsoft.com/office/word/2010/wordprocessingCanvas" xmlns:cx="http://schemas.microsoft.com/office/drawing/2014/chartex" xmlns:cx1="http://schemas.microsoft.com/office/drawing/2015/9/8/chartex" xmlns:cx2="http://schemas.microsoft.com/office/drawing/2015/10/21/chartex" xmlns:cx3="http://schemas.microsoft.com/office/drawing/2016/5/9/chartex" xmlns:cx4="http://schemas.microsoft.com/office/drawing/2016/5/10/chartex" xmlns:cx5="http://schemas.microsoft.com/office/drawing/2016/5/11/chartex" xmlns:cx6="http://schemas.microsoft.com/office/drawing/2016/5/12/chartex" xmlns:cx7="http://schemas.microsoft.com/office/drawing/2016/5/13/chartex" xmlns:cx8="http://schemas.microsoft.com/office/drawing/2016/5/14/chartex" xmlns:mc="http://schemas.openxmlformats.org/markup-compatibility/2006" xmlns:aink="http://schemas.microsoft.com/office/drawing/2016/ink" xmlns:am3d="http://schemas.microsoft.com/office/drawing/2017/model3d" xmlns:o="urn:schemas-microsoft-com:office:office" xmlns:oel="http://schemas.microsoft.com/office/2019/extlst" xmlns:r="http://schemas.openxmlformats.org/officeDocument/2006/relationships" xmlns:m="http://schemas.openxmlformats.org/officeDocument/2006/math" xmlns:v="urn:schemas-microsoft-com:vml" xmlns:wp14="http://schemas.microsoft.com/office/word/2010/wordprocessingDrawing" xmlns:wp="http://schemas.openxmlformats.org/drawingml/2006/wordprocessingDrawing" xmlns:w10="urn:schemas-microsoft-com:office:word" xmlns:w="http://schemas.openxmlformats.org/wordprocessingml/2006/main" xmlns:w14="http://schemas.microsoft.com/office/word/2010/wordml" xmlns:w15="http://schemas.microsoft.com/office/word/2012/wordml" xmlns:w16cex="http://schemas.microsoft.com/office/word/2018/wordml/cex" xmlns:w16cid="http://schemas.microsoft.com/office/word/2016/wordml/cid" xmlns:w16="http://schemas.microsoft.com/office/word/2018/wordml" xmlns:w16sdtdh="http://schemas.microsoft.com/office/word/2020/wordml/sdtdatahash" xmlns:w16se="http://schemas.microsoft.com/office/word/2015/wordml/symex" xmlns:wpg="http://schemas.microsoft.com/office/word/2010/wordprocessingGroup" xmlns:wpi="http://schemas.microsoft.com/office/word/2010/wordprocessingInk" xmlns:wne="http://schemas.microsoft.com/office/word/2006/wordml" xmlns:wps="http://schemas.microsoft.com/office/word/2010/wordprocessingShape" mc:Ignorable="w14 w15 w16se w16cid w16 w16cex w16sdtdh wp14">
   <w:p>
     <w:pPr>
       <w:pStyle w:val="Rodap"/>
@@ -907,7 +2671,6 @@
         <w:docPartUnique/>
       </w:docPartObj>
     </w:sdtPr>
-    <w:sdtEndPr/>
     <w:sdtContent>
       <w:sdt>
         <w:sdtPr>
@@ -917,7 +2680,6 @@
             <w:docPartUnique/>
           </w:docPartObj>
         </w:sdtPr>
-        <w:sdtEndPr/>
         <w:sdtContent>
           <w:p>
             <w:pPr>
@@ -1034,7 +2796,7 @@
 </file>
 
 <file path=word/footnotes.xml><?xml version="1.0" encoding="utf-8"?>
-<w:footnotes xmlns:wpc="http://schemas.microsoft.com/office/word/2010/wordprocessingCanvas" xmlns:cx="http://schemas.microsoft.com/office/drawing/2014/chartex" xmlns:cx1="http://schemas.microsoft.com/office/drawing/2015/9/8/chartex" xmlns:cx2="http://schemas.microsoft.com/office/drawing/2015/10/21/chartex" xmlns:cx3="http://schemas.microsoft.com/office/drawing/2016/5/9/chartex" xmlns:cx4="http://schemas.microsoft.com/office/drawing/2016/5/10/chartex" xmlns:cx5="http://schemas.microsoft.com/office/drawing/2016/5/11/chartex" xmlns:cx6="http://schemas.microsoft.com/office/drawing/2016/5/12/chartex" xmlns:cx7="http://schemas.microsoft.com/office/drawing/2016/5/13/chartex" xmlns:cx8="http://schemas.microsoft.com/office/drawing/2016/5/14/chartex" xmlns:mc="http://schemas.openxmlformats.org/markup-compatibility/2006" xmlns:aink="http://schemas.microsoft.com/office/drawing/2016/ink" xmlns:am3d="http://schemas.microsoft.com/office/drawing/2017/model3d" xmlns:o="urn:schemas-microsoft-com:office:office" xmlns:r="http://schemas.openxmlformats.org/officeDocument/2006/relationships" xmlns:m="http://schemas.openxmlformats.org/officeDocument/2006/math" xmlns:v="urn:schemas-microsoft-com:vml" xmlns:wp14="http://schemas.microsoft.com/office/word/2010/wordprocessingDrawing" xmlns:wp="http://schemas.openxmlformats.org/drawingml/2006/wordprocessingDrawing" xmlns:w10="urn:schemas-microsoft-com:office:word" xmlns:w="http://schemas.openxmlformats.org/wordprocessingml/2006/main" xmlns:w14="http://schemas.microsoft.com/office/word/2010/wordml" xmlns:w15="http://schemas.microsoft.com/office/word/2012/wordml" xmlns:w16cid="http://schemas.microsoft.com/office/word/2016/wordml/cid" xmlns:w16se="http://schemas.microsoft.com/office/word/2015/wordml/symex" xmlns:wpg="http://schemas.microsoft.com/office/word/2010/wordprocessingGroup" xmlns:wpi="http://schemas.microsoft.com/office/word/2010/wordprocessingInk" xmlns:wne="http://schemas.microsoft.com/office/word/2006/wordml" xmlns:wps="http://schemas.microsoft.com/office/word/2010/wordprocessingShape" mc:Ignorable="w14 w15 w16se w16cid wp14">
+<w:footnotes xmlns:wpc="http://schemas.microsoft.com/office/word/2010/wordprocessingCanvas" xmlns:cx="http://schemas.microsoft.com/office/drawing/2014/chartex" xmlns:cx1="http://schemas.microsoft.com/office/drawing/2015/9/8/chartex" xmlns:cx2="http://schemas.microsoft.com/office/drawing/2015/10/21/chartex" xmlns:cx3="http://schemas.microsoft.com/office/drawing/2016/5/9/chartex" xmlns:cx4="http://schemas.microsoft.com/office/drawing/2016/5/10/chartex" xmlns:cx5="http://schemas.microsoft.com/office/drawing/2016/5/11/chartex" xmlns:cx6="http://schemas.microsoft.com/office/drawing/2016/5/12/chartex" xmlns:cx7="http://schemas.microsoft.com/office/drawing/2016/5/13/chartex" xmlns:cx8="http://schemas.microsoft.com/office/drawing/2016/5/14/chartex" xmlns:mc="http://schemas.openxmlformats.org/markup-compatibility/2006" xmlns:aink="http://schemas.microsoft.com/office/drawing/2016/ink" xmlns:am3d="http://schemas.microsoft.com/office/drawing/2017/model3d" xmlns:o="urn:schemas-microsoft-com:office:office" xmlns:oel="http://schemas.microsoft.com/office/2019/extlst" xmlns:r="http://schemas.openxmlformats.org/officeDocument/2006/relationships" xmlns:m="http://schemas.openxmlformats.org/officeDocument/2006/math" xmlns:v="urn:schemas-microsoft-com:vml" xmlns:wp14="http://schemas.microsoft.com/office/word/2010/wordprocessingDrawing" xmlns:wp="http://schemas.openxmlformats.org/drawingml/2006/wordprocessingDrawing" xmlns:w10="urn:schemas-microsoft-com:office:word" xmlns:w="http://schemas.openxmlformats.org/wordprocessingml/2006/main" xmlns:w14="http://schemas.microsoft.com/office/word/2010/wordml" xmlns:w15="http://schemas.microsoft.com/office/word/2012/wordml" xmlns:w16cex="http://schemas.microsoft.com/office/word/2018/wordml/cex" xmlns:w16cid="http://schemas.microsoft.com/office/word/2016/wordml/cid" xmlns:w16="http://schemas.microsoft.com/office/word/2018/wordml" xmlns:w16sdtdh="http://schemas.microsoft.com/office/word/2020/wordml/sdtdatahash" xmlns:w16se="http://schemas.microsoft.com/office/word/2015/wordml/symex" xmlns:wpg="http://schemas.microsoft.com/office/word/2010/wordprocessingGroup" xmlns:wpi="http://schemas.microsoft.com/office/word/2010/wordprocessingInk" xmlns:wne="http://schemas.microsoft.com/office/word/2006/wordml" xmlns:wps="http://schemas.microsoft.com/office/word/2010/wordprocessingShape" mc:Ignorable="w14 w15 w16se w16cid w16 w16cex w16sdtdh wp14">
   <w:footnote w:type="separator" w:id="-1">
     <w:p>
       <w:r>
@@ -1053,7 +2815,7 @@
 </file>
 
 <file path=word/header1.xml><?xml version="1.0" encoding="utf-8"?>
-<w:hdr xmlns:wpc="http://schemas.microsoft.com/office/word/2010/wordprocessingCanvas" xmlns:cx="http://schemas.microsoft.com/office/drawing/2014/chartex" xmlns:cx1="http://schemas.microsoft.com/office/drawing/2015/9/8/chartex" xmlns:cx2="http://schemas.microsoft.com/office/drawing/2015/10/21/chartex" xmlns:cx3="http://schemas.microsoft.com/office/drawing/2016/5/9/chartex" xmlns:cx4="http://schemas.microsoft.com/office/drawing/2016/5/10/chartex" xmlns:cx5="http://schemas.microsoft.com/office/drawing/2016/5/11/chartex" xmlns:cx6="http://schemas.microsoft.com/office/drawing/2016/5/12/chartex" xmlns:cx7="http://schemas.microsoft.com/office/drawing/2016/5/13/chartex" xmlns:cx8="http://schemas.microsoft.com/office/drawing/2016/5/14/chartex" xmlns:mc="http://schemas.openxmlformats.org/markup-compatibility/2006" xmlns:aink="http://schemas.microsoft.com/office/drawing/2016/ink" xmlns:am3d="http://schemas.microsoft.com/office/drawing/2017/model3d" xmlns:o="urn:schemas-microsoft-com:office:office" xmlns:r="http://schemas.openxmlformats.org/officeDocument/2006/relationships" xmlns:m="http://schemas.openxmlformats.org/officeDocument/2006/math" xmlns:v="urn:schemas-microsoft-com:vml" xmlns:wp14="http://schemas.microsoft.com/office/word/2010/wordprocessingDrawing" xmlns:wp="http://schemas.openxmlformats.org/drawingml/2006/wordprocessingDrawing" xmlns:w10="urn:schemas-microsoft-com:office:word" xmlns:w="http://schemas.openxmlformats.org/wordprocessingml/2006/main" xmlns:w14="http://schemas.microsoft.com/office/word/2010/wordml" xmlns:w15="http://schemas.microsoft.com/office/word/2012/wordml" xmlns:w16cid="http://schemas.microsoft.com/office/word/2016/wordml/cid" xmlns:w16se="http://schemas.microsoft.com/office/word/2015/wordml/symex" xmlns:wpg="http://schemas.microsoft.com/office/word/2010/wordprocessingGroup" xmlns:wpi="http://schemas.microsoft.com/office/word/2010/wordprocessingInk" xmlns:wne="http://schemas.microsoft.com/office/word/2006/wordml" xmlns:wps="http://schemas.microsoft.com/office/word/2010/wordprocessingShape" mc:Ignorable="w14 w15 w16se w16cid wp14">
+<w:hdr xmlns:wpc="http://schemas.microsoft.com/office/word/2010/wordprocessingCanvas" xmlns:cx="http://schemas.microsoft.com/office/drawing/2014/chartex" xmlns:cx1="http://schemas.microsoft.com/office/drawing/2015/9/8/chartex" xmlns:cx2="http://schemas.microsoft.com/office/drawing/2015/10/21/chartex" xmlns:cx3="http://schemas.microsoft.com/office/drawing/2016/5/9/chartex" xmlns:cx4="http://schemas.microsoft.com/office/drawing/2016/5/10/chartex" xmlns:cx5="http://schemas.microsoft.com/office/drawing/2016/5/11/chartex" xmlns:cx6="http://schemas.microsoft.com/office/drawing/2016/5/12/chartex" xmlns:cx7="http://schemas.microsoft.com/office/drawing/2016/5/13/chartex" xmlns:cx8="http://schemas.microsoft.com/office/drawing/2016/5/14/chartex" xmlns:mc="http://schemas.openxmlformats.org/markup-compatibility/2006" xmlns:aink="http://schemas.microsoft.com/office/drawing/2016/ink" xmlns:am3d="http://schemas.microsoft.com/office/drawing/2017/model3d" xmlns:o="urn:schemas-microsoft-com:office:office" xmlns:oel="http://schemas.microsoft.com/office/2019/extlst" xmlns:r="http://schemas.openxmlformats.org/officeDocument/2006/relationships" xmlns:m="http://schemas.openxmlformats.org/officeDocument/2006/math" xmlns:v="urn:schemas-microsoft-com:vml" xmlns:wp14="http://schemas.microsoft.com/office/word/2010/wordprocessingDrawing" xmlns:wp="http://schemas.openxmlformats.org/drawingml/2006/wordprocessingDrawing" xmlns:w10="urn:schemas-microsoft-com:office:word" xmlns:w="http://schemas.openxmlformats.org/wordprocessingml/2006/main" xmlns:w14="http://schemas.microsoft.com/office/word/2010/wordml" xmlns:w15="http://schemas.microsoft.com/office/word/2012/wordml" xmlns:w16cex="http://schemas.microsoft.com/office/word/2018/wordml/cex" xmlns:w16cid="http://schemas.microsoft.com/office/word/2016/wordml/cid" xmlns:w16="http://schemas.microsoft.com/office/word/2018/wordml" xmlns:w16sdtdh="http://schemas.microsoft.com/office/word/2020/wordml/sdtdatahash" xmlns:w16se="http://schemas.microsoft.com/office/word/2015/wordml/symex" xmlns:wpg="http://schemas.microsoft.com/office/word/2010/wordprocessingGroup" xmlns:wpi="http://schemas.microsoft.com/office/word/2010/wordprocessingInk" xmlns:wne="http://schemas.microsoft.com/office/word/2006/wordml" xmlns:wps="http://schemas.microsoft.com/office/word/2010/wordprocessingShape" mc:Ignorable="w14 w15 w16se w16cid w16 w16cex w16sdtdh wp14">
   <w:p>
     <w:pPr>
       <w:pStyle w:val="Cabealho"/>
@@ -1208,7 +2970,7 @@
 </file>
 
 <file path=word/numbering.xml><?xml version="1.0" encoding="utf-8"?>
-<w:numbering xmlns:wpc="http://schemas.microsoft.com/office/word/2010/wordprocessingCanvas" xmlns:cx="http://schemas.microsoft.com/office/drawing/2014/chartex" xmlns:cx1="http://schemas.microsoft.com/office/drawing/2015/9/8/chartex" xmlns:cx2="http://schemas.microsoft.com/office/drawing/2015/10/21/chartex" xmlns:cx3="http://schemas.microsoft.com/office/drawing/2016/5/9/chartex" xmlns:cx4="http://schemas.microsoft.com/office/drawing/2016/5/10/chartex" xmlns:cx5="http://schemas.microsoft.com/office/drawing/2016/5/11/chartex" xmlns:cx6="http://schemas.microsoft.com/office/drawing/2016/5/12/chartex" xmlns:cx7="http://schemas.microsoft.com/office/drawing/2016/5/13/chartex" xmlns:cx8="http://schemas.microsoft.com/office/drawing/2016/5/14/chartex" xmlns:mc="http://schemas.openxmlformats.org/markup-compatibility/2006" xmlns:aink="http://schemas.microsoft.com/office/drawing/2016/ink" xmlns:am3d="http://schemas.microsoft.com/office/drawing/2017/model3d" xmlns:o="urn:schemas-microsoft-com:office:office" xmlns:r="http://schemas.openxmlformats.org/officeDocument/2006/relationships" xmlns:m="http://schemas.openxmlformats.org/officeDocument/2006/math" xmlns:v="urn:schemas-microsoft-com:vml" xmlns:wp14="http://schemas.microsoft.com/office/word/2010/wordprocessingDrawing" xmlns:wp="http://schemas.openxmlformats.org/drawingml/2006/wordprocessingDrawing" xmlns:w10="urn:schemas-microsoft-com:office:word" xmlns:w="http://schemas.openxmlformats.org/wordprocessingml/2006/main" xmlns:w14="http://schemas.microsoft.com/office/word/2010/wordml" xmlns:w15="http://schemas.microsoft.com/office/word/2012/wordml" xmlns:w16cid="http://schemas.microsoft.com/office/word/2016/wordml/cid" xmlns:w16se="http://schemas.microsoft.com/office/word/2015/wordml/symex" xmlns:wpg="http://schemas.microsoft.com/office/word/2010/wordprocessingGroup" xmlns:wpi="http://schemas.microsoft.com/office/word/2010/wordprocessingInk" xmlns:wne="http://schemas.microsoft.com/office/word/2006/wordml" xmlns:wps="http://schemas.microsoft.com/office/word/2010/wordprocessingShape" mc:Ignorable="w14 w15 w16se w16cid wp14">
+<w:numbering xmlns:wpc="http://schemas.microsoft.com/office/word/2010/wordprocessingCanvas" xmlns:cx="http://schemas.microsoft.com/office/drawing/2014/chartex" xmlns:cx1="http://schemas.microsoft.com/office/drawing/2015/9/8/chartex" xmlns:cx2="http://schemas.microsoft.com/office/drawing/2015/10/21/chartex" xmlns:cx3="http://schemas.microsoft.com/office/drawing/2016/5/9/chartex" xmlns:cx4="http://schemas.microsoft.com/office/drawing/2016/5/10/chartex" xmlns:cx5="http://schemas.microsoft.com/office/drawing/2016/5/11/chartex" xmlns:cx6="http://schemas.microsoft.com/office/drawing/2016/5/12/chartex" xmlns:cx7="http://schemas.microsoft.com/office/drawing/2016/5/13/chartex" xmlns:cx8="http://schemas.microsoft.com/office/drawing/2016/5/14/chartex" xmlns:mc="http://schemas.openxmlformats.org/markup-compatibility/2006" xmlns:aink="http://schemas.microsoft.com/office/drawing/2016/ink" xmlns:am3d="http://schemas.microsoft.com/office/drawing/2017/model3d" xmlns:o="urn:schemas-microsoft-com:office:office" xmlns:oel="http://schemas.microsoft.com/office/2019/extlst" xmlns:r="http://schemas.openxmlformats.org/officeDocument/2006/relationships" xmlns:m="http://schemas.openxmlformats.org/officeDocument/2006/math" xmlns:v="urn:schemas-microsoft-com:vml" xmlns:wp14="http://schemas.microsoft.com/office/word/2010/wordprocessingDrawing" xmlns:wp="http://schemas.openxmlformats.org/drawingml/2006/wordprocessingDrawing" xmlns:w10="urn:schemas-microsoft-com:office:word" xmlns:w="http://schemas.openxmlformats.org/wordprocessingml/2006/main" xmlns:w14="http://schemas.microsoft.com/office/word/2010/wordml" xmlns:w15="http://schemas.microsoft.com/office/word/2012/wordml" xmlns:w16cex="http://schemas.microsoft.com/office/word/2018/wordml/cex" xmlns:w16cid="http://schemas.microsoft.com/office/word/2016/wordml/cid" xmlns:w16="http://schemas.microsoft.com/office/word/2018/wordml" xmlns:w16sdtdh="http://schemas.microsoft.com/office/word/2020/wordml/sdtdatahash" xmlns:w16se="http://schemas.microsoft.com/office/word/2015/wordml/symex" xmlns:wpg="http://schemas.microsoft.com/office/word/2010/wordprocessingGroup" xmlns:wpi="http://schemas.microsoft.com/office/word/2010/wordprocessingInk" xmlns:wne="http://schemas.microsoft.com/office/word/2006/wordml" xmlns:wps="http://schemas.microsoft.com/office/word/2010/wordprocessingShape" mc:Ignorable="w14 w15 w16se w16cid w16 w16cex w16sdtdh wp14">
   <w:abstractNum w:abstractNumId="0" w15:restartNumberingAfterBreak="0">
     <w:nsid w:val="02FC1D83"/>
     <w:multiLevelType w:val="hybridMultilevel"/>
@@ -2690,6 +4452,155 @@
     </w:lvl>
   </w:abstractNum>
   <w:abstractNum w:abstractNumId="14" w15:restartNumberingAfterBreak="0">
+    <w:nsid w:val="45AA4918"/>
+    <w:multiLevelType w:val="multilevel"/>
+    <w:tmpl w:val="9F1C985C"/>
+    <w:lvl w:ilvl="0">
+      <w:start w:val="1"/>
+      <w:numFmt w:val="bullet"/>
+      <w:lvlText w:val=""/>
+      <w:lvlJc w:val="left"/>
+      <w:pPr>
+        <w:tabs>
+          <w:tab w:val="num" w:pos="720"/>
+        </w:tabs>
+        <w:ind w:left="720" w:hanging="360"/>
+      </w:pPr>
+      <w:rPr>
+        <w:rFonts w:ascii="Symbol" w:hAnsi="Symbol" w:hint="default"/>
+        <w:sz w:val="20"/>
+      </w:rPr>
+    </w:lvl>
+    <w:lvl w:ilvl="1" w:tentative="1">
+      <w:start w:val="1"/>
+      <w:numFmt w:val="bullet"/>
+      <w:lvlText w:val="o"/>
+      <w:lvlJc w:val="left"/>
+      <w:pPr>
+        <w:tabs>
+          <w:tab w:val="num" w:pos="1440"/>
+        </w:tabs>
+        <w:ind w:left="1440" w:hanging="360"/>
+      </w:pPr>
+      <w:rPr>
+        <w:rFonts w:ascii="Courier New" w:hAnsi="Courier New" w:hint="default"/>
+        <w:sz w:val="20"/>
+      </w:rPr>
+    </w:lvl>
+    <w:lvl w:ilvl="2" w:tentative="1">
+      <w:start w:val="1"/>
+      <w:numFmt w:val="bullet"/>
+      <w:lvlText w:val=""/>
+      <w:lvlJc w:val="left"/>
+      <w:pPr>
+        <w:tabs>
+          <w:tab w:val="num" w:pos="2160"/>
+        </w:tabs>
+        <w:ind w:left="2160" w:hanging="360"/>
+      </w:pPr>
+      <w:rPr>
+        <w:rFonts w:ascii="Wingdings" w:hAnsi="Wingdings" w:hint="default"/>
+        <w:sz w:val="20"/>
+      </w:rPr>
+    </w:lvl>
+    <w:lvl w:ilvl="3" w:tentative="1">
+      <w:start w:val="1"/>
+      <w:numFmt w:val="bullet"/>
+      <w:lvlText w:val=""/>
+      <w:lvlJc w:val="left"/>
+      <w:pPr>
+        <w:tabs>
+          <w:tab w:val="num" w:pos="2880"/>
+        </w:tabs>
+        <w:ind w:left="2880" w:hanging="360"/>
+      </w:pPr>
+      <w:rPr>
+        <w:rFonts w:ascii="Wingdings" w:hAnsi="Wingdings" w:hint="default"/>
+        <w:sz w:val="20"/>
+      </w:rPr>
+    </w:lvl>
+    <w:lvl w:ilvl="4" w:tentative="1">
+      <w:start w:val="1"/>
+      <w:numFmt w:val="bullet"/>
+      <w:lvlText w:val=""/>
+      <w:lvlJc w:val="left"/>
+      <w:pPr>
+        <w:tabs>
+          <w:tab w:val="num" w:pos="3600"/>
+        </w:tabs>
+        <w:ind w:left="3600" w:hanging="360"/>
+      </w:pPr>
+      <w:rPr>
+        <w:rFonts w:ascii="Wingdings" w:hAnsi="Wingdings" w:hint="default"/>
+        <w:sz w:val="20"/>
+      </w:rPr>
+    </w:lvl>
+    <w:lvl w:ilvl="5" w:tentative="1">
+      <w:start w:val="1"/>
+      <w:numFmt w:val="bullet"/>
+      <w:lvlText w:val=""/>
+      <w:lvlJc w:val="left"/>
+      <w:pPr>
+        <w:tabs>
+          <w:tab w:val="num" w:pos="4320"/>
+        </w:tabs>
+        <w:ind w:left="4320" w:hanging="360"/>
+      </w:pPr>
+      <w:rPr>
+        <w:rFonts w:ascii="Wingdings" w:hAnsi="Wingdings" w:hint="default"/>
+        <w:sz w:val="20"/>
+      </w:rPr>
+    </w:lvl>
+    <w:lvl w:ilvl="6" w:tentative="1">
+      <w:start w:val="1"/>
+      <w:numFmt w:val="bullet"/>
+      <w:lvlText w:val=""/>
+      <w:lvlJc w:val="left"/>
+      <w:pPr>
+        <w:tabs>
+          <w:tab w:val="num" w:pos="5040"/>
+        </w:tabs>
+        <w:ind w:left="5040" w:hanging="360"/>
+      </w:pPr>
+      <w:rPr>
+        <w:rFonts w:ascii="Wingdings" w:hAnsi="Wingdings" w:hint="default"/>
+        <w:sz w:val="20"/>
+      </w:rPr>
+    </w:lvl>
+    <w:lvl w:ilvl="7" w:tentative="1">
+      <w:start w:val="1"/>
+      <w:numFmt w:val="bullet"/>
+      <w:lvlText w:val=""/>
+      <w:lvlJc w:val="left"/>
+      <w:pPr>
+        <w:tabs>
+          <w:tab w:val="num" w:pos="5760"/>
+        </w:tabs>
+        <w:ind w:left="5760" w:hanging="360"/>
+      </w:pPr>
+      <w:rPr>
+        <w:rFonts w:ascii="Wingdings" w:hAnsi="Wingdings" w:hint="default"/>
+        <w:sz w:val="20"/>
+      </w:rPr>
+    </w:lvl>
+    <w:lvl w:ilvl="8" w:tentative="1">
+      <w:start w:val="1"/>
+      <w:numFmt w:val="bullet"/>
+      <w:lvlText w:val=""/>
+      <w:lvlJc w:val="left"/>
+      <w:pPr>
+        <w:tabs>
+          <w:tab w:val="num" w:pos="6480"/>
+        </w:tabs>
+        <w:ind w:left="6480" w:hanging="360"/>
+      </w:pPr>
+      <w:rPr>
+        <w:rFonts w:ascii="Wingdings" w:hAnsi="Wingdings" w:hint="default"/>
+        <w:sz w:val="20"/>
+      </w:rPr>
+    </w:lvl>
+  </w:abstractNum>
+  <w:abstractNum w:abstractNumId="15" w15:restartNumberingAfterBreak="0">
     <w:nsid w:val="476A766E"/>
     <w:multiLevelType w:val="hybridMultilevel"/>
     <w:tmpl w:val="6C7C6270"/>
@@ -2806,7 +4717,7 @@
       </w:rPr>
     </w:lvl>
   </w:abstractNum>
-  <w:abstractNum w:abstractNumId="15" w15:restartNumberingAfterBreak="0">
+  <w:abstractNum w:abstractNumId="16" w15:restartNumberingAfterBreak="0">
     <w:nsid w:val="4A613EBC"/>
     <w:multiLevelType w:val="hybridMultilevel"/>
     <w:tmpl w:val="E154E130"/>
@@ -2892,7 +4803,7 @@
       </w:pPr>
     </w:lvl>
   </w:abstractNum>
-  <w:abstractNum w:abstractNumId="16" w15:restartNumberingAfterBreak="0">
+  <w:abstractNum w:abstractNumId="17" w15:restartNumberingAfterBreak="0">
     <w:nsid w:val="4D7A035C"/>
     <w:multiLevelType w:val="hybridMultilevel"/>
     <w:tmpl w:val="EB107D44"/>
@@ -2981,7 +4892,7 @@
       </w:pPr>
     </w:lvl>
   </w:abstractNum>
-  <w:abstractNum w:abstractNumId="17" w15:restartNumberingAfterBreak="0">
+  <w:abstractNum w:abstractNumId="18" w15:restartNumberingAfterBreak="0">
     <w:nsid w:val="4DA57EF6"/>
     <w:multiLevelType w:val="hybridMultilevel"/>
     <w:tmpl w:val="834EB0BC"/>
@@ -3070,7 +4981,7 @@
       </w:pPr>
     </w:lvl>
   </w:abstractNum>
-  <w:abstractNum w:abstractNumId="18" w15:restartNumberingAfterBreak="0">
+  <w:abstractNum w:abstractNumId="19" w15:restartNumberingAfterBreak="0">
     <w:nsid w:val="518765AD"/>
     <w:multiLevelType w:val="hybridMultilevel"/>
     <w:tmpl w:val="F38A87E0"/>
@@ -3187,7 +5098,7 @@
       </w:rPr>
     </w:lvl>
   </w:abstractNum>
-  <w:abstractNum w:abstractNumId="19" w15:restartNumberingAfterBreak="0">
+  <w:abstractNum w:abstractNumId="20" w15:restartNumberingAfterBreak="0">
     <w:nsid w:val="576F7B49"/>
     <w:multiLevelType w:val="hybridMultilevel"/>
     <w:tmpl w:val="C7A0CACA"/>
@@ -3273,7 +5184,7 @@
       </w:pPr>
     </w:lvl>
   </w:abstractNum>
-  <w:abstractNum w:abstractNumId="20" w15:restartNumberingAfterBreak="0">
+  <w:abstractNum w:abstractNumId="21" w15:restartNumberingAfterBreak="0">
     <w:nsid w:val="57C032F7"/>
     <w:multiLevelType w:val="hybridMultilevel"/>
     <w:tmpl w:val="FA8C9270"/>
@@ -3359,7 +5270,156 @@
       </w:pPr>
     </w:lvl>
   </w:abstractNum>
-  <w:abstractNum w:abstractNumId="21" w15:restartNumberingAfterBreak="0">
+  <w:abstractNum w:abstractNumId="22" w15:restartNumberingAfterBreak="0">
+    <w:nsid w:val="57FB0B9D"/>
+    <w:multiLevelType w:val="multilevel"/>
+    <w:tmpl w:val="8732FA4E"/>
+    <w:lvl w:ilvl="0">
+      <w:start w:val="1"/>
+      <w:numFmt w:val="bullet"/>
+      <w:lvlText w:val=""/>
+      <w:lvlJc w:val="left"/>
+      <w:pPr>
+        <w:tabs>
+          <w:tab w:val="num" w:pos="720"/>
+        </w:tabs>
+        <w:ind w:left="720" w:hanging="360"/>
+      </w:pPr>
+      <w:rPr>
+        <w:rFonts w:ascii="Symbol" w:hAnsi="Symbol" w:hint="default"/>
+        <w:sz w:val="20"/>
+      </w:rPr>
+    </w:lvl>
+    <w:lvl w:ilvl="1" w:tentative="1">
+      <w:start w:val="1"/>
+      <w:numFmt w:val="bullet"/>
+      <w:lvlText w:val="o"/>
+      <w:lvlJc w:val="left"/>
+      <w:pPr>
+        <w:tabs>
+          <w:tab w:val="num" w:pos="1440"/>
+        </w:tabs>
+        <w:ind w:left="1440" w:hanging="360"/>
+      </w:pPr>
+      <w:rPr>
+        <w:rFonts w:ascii="Courier New" w:hAnsi="Courier New" w:hint="default"/>
+        <w:sz w:val="20"/>
+      </w:rPr>
+    </w:lvl>
+    <w:lvl w:ilvl="2" w:tentative="1">
+      <w:start w:val="1"/>
+      <w:numFmt w:val="bullet"/>
+      <w:lvlText w:val=""/>
+      <w:lvlJc w:val="left"/>
+      <w:pPr>
+        <w:tabs>
+          <w:tab w:val="num" w:pos="2160"/>
+        </w:tabs>
+        <w:ind w:left="2160" w:hanging="360"/>
+      </w:pPr>
+      <w:rPr>
+        <w:rFonts w:ascii="Wingdings" w:hAnsi="Wingdings" w:hint="default"/>
+        <w:sz w:val="20"/>
+      </w:rPr>
+    </w:lvl>
+    <w:lvl w:ilvl="3" w:tentative="1">
+      <w:start w:val="1"/>
+      <w:numFmt w:val="bullet"/>
+      <w:lvlText w:val=""/>
+      <w:lvlJc w:val="left"/>
+      <w:pPr>
+        <w:tabs>
+          <w:tab w:val="num" w:pos="2880"/>
+        </w:tabs>
+        <w:ind w:left="2880" w:hanging="360"/>
+      </w:pPr>
+      <w:rPr>
+        <w:rFonts w:ascii="Wingdings" w:hAnsi="Wingdings" w:hint="default"/>
+        <w:sz w:val="20"/>
+      </w:rPr>
+    </w:lvl>
+    <w:lvl w:ilvl="4" w:tentative="1">
+      <w:start w:val="1"/>
+      <w:numFmt w:val="bullet"/>
+      <w:lvlText w:val=""/>
+      <w:lvlJc w:val="left"/>
+      <w:pPr>
+        <w:tabs>
+          <w:tab w:val="num" w:pos="3600"/>
+        </w:tabs>
+        <w:ind w:left="3600" w:hanging="360"/>
+      </w:pPr>
+      <w:rPr>
+        <w:rFonts w:ascii="Wingdings" w:hAnsi="Wingdings" w:hint="default"/>
+        <w:sz w:val="20"/>
+      </w:rPr>
+    </w:lvl>
+    <w:lvl w:ilvl="5" w:tentative="1">
+      <w:start w:val="1"/>
+      <w:numFmt w:val="bullet"/>
+      <w:lvlText w:val=""/>
+      <w:lvlJc w:val="left"/>
+      <w:pPr>
+        <w:tabs>
+          <w:tab w:val="num" w:pos="4320"/>
+        </w:tabs>
+        <w:ind w:left="4320" w:hanging="360"/>
+      </w:pPr>
+      <w:rPr>
+        <w:rFonts w:ascii="Wingdings" w:hAnsi="Wingdings" w:hint="default"/>
+        <w:sz w:val="20"/>
+      </w:rPr>
+    </w:lvl>
+    <w:lvl w:ilvl="6" w:tentative="1">
+      <w:start w:val="1"/>
+      <w:numFmt w:val="bullet"/>
+      <w:lvlText w:val=""/>
+      <w:lvlJc w:val="left"/>
+      <w:pPr>
+        <w:tabs>
+          <w:tab w:val="num" w:pos="5040"/>
+        </w:tabs>
+        <w:ind w:left="5040" w:hanging="360"/>
+      </w:pPr>
+      <w:rPr>
+        <w:rFonts w:ascii="Wingdings" w:hAnsi="Wingdings" w:hint="default"/>
+        <w:sz w:val="20"/>
+      </w:rPr>
+    </w:lvl>
+    <w:lvl w:ilvl="7" w:tentative="1">
+      <w:start w:val="1"/>
+      <w:numFmt w:val="bullet"/>
+      <w:lvlText w:val=""/>
+      <w:lvlJc w:val="left"/>
+      <w:pPr>
+        <w:tabs>
+          <w:tab w:val="num" w:pos="5760"/>
+        </w:tabs>
+        <w:ind w:left="5760" w:hanging="360"/>
+      </w:pPr>
+      <w:rPr>
+        <w:rFonts w:ascii="Wingdings" w:hAnsi="Wingdings" w:hint="default"/>
+        <w:sz w:val="20"/>
+      </w:rPr>
+    </w:lvl>
+    <w:lvl w:ilvl="8" w:tentative="1">
+      <w:start w:val="1"/>
+      <w:numFmt w:val="bullet"/>
+      <w:lvlText w:val=""/>
+      <w:lvlJc w:val="left"/>
+      <w:pPr>
+        <w:tabs>
+          <w:tab w:val="num" w:pos="6480"/>
+        </w:tabs>
+        <w:ind w:left="6480" w:hanging="360"/>
+      </w:pPr>
+      <w:rPr>
+        <w:rFonts w:ascii="Wingdings" w:hAnsi="Wingdings" w:hint="default"/>
+        <w:sz w:val="20"/>
+      </w:rPr>
+    </w:lvl>
+  </w:abstractNum>
+  <w:abstractNum w:abstractNumId="23" w15:restartNumberingAfterBreak="0">
     <w:nsid w:val="5A3322FC"/>
     <w:multiLevelType w:val="hybridMultilevel"/>
     <w:tmpl w:val="A57AC966"/>
@@ -3445,7 +5505,7 @@
       </w:pPr>
     </w:lvl>
   </w:abstractNum>
-  <w:abstractNum w:abstractNumId="22" w15:restartNumberingAfterBreak="0">
+  <w:abstractNum w:abstractNumId="24" w15:restartNumberingAfterBreak="0">
     <w:nsid w:val="66A33774"/>
     <w:multiLevelType w:val="hybridMultilevel"/>
     <w:tmpl w:val="2FB0CFF8"/>
@@ -3563,7 +5623,7 @@
       </w:rPr>
     </w:lvl>
   </w:abstractNum>
-  <w:abstractNum w:abstractNumId="23" w15:restartNumberingAfterBreak="0">
+  <w:abstractNum w:abstractNumId="25" w15:restartNumberingAfterBreak="0">
     <w:nsid w:val="67296D9A"/>
     <w:multiLevelType w:val="hybridMultilevel"/>
     <w:tmpl w:val="08F88BE2"/>
@@ -3649,7 +5709,7 @@
       </w:pPr>
     </w:lvl>
   </w:abstractNum>
-  <w:abstractNum w:abstractNumId="24" w15:restartNumberingAfterBreak="0">
+  <w:abstractNum w:abstractNumId="26" w15:restartNumberingAfterBreak="0">
     <w:nsid w:val="690522D1"/>
     <w:multiLevelType w:val="hybridMultilevel"/>
     <w:tmpl w:val="C6123FC4"/>
@@ -3765,7 +5825,7 @@
       </w:rPr>
     </w:lvl>
   </w:abstractNum>
-  <w:abstractNum w:abstractNumId="25" w15:restartNumberingAfterBreak="0">
+  <w:abstractNum w:abstractNumId="27" w15:restartNumberingAfterBreak="0">
     <w:nsid w:val="6EE7647B"/>
     <w:multiLevelType w:val="hybridMultilevel"/>
     <w:tmpl w:val="6F0A4046"/>
@@ -3854,7 +5914,7 @@
       </w:pPr>
     </w:lvl>
   </w:abstractNum>
-  <w:abstractNum w:abstractNumId="26" w15:restartNumberingAfterBreak="0">
+  <w:abstractNum w:abstractNumId="28" w15:restartNumberingAfterBreak="0">
     <w:nsid w:val="74F122DC"/>
     <w:multiLevelType w:val="hybridMultilevel"/>
     <w:tmpl w:val="F8A0DB9A"/>
@@ -3940,7 +6000,7 @@
       </w:pPr>
     </w:lvl>
   </w:abstractNum>
-  <w:abstractNum w:abstractNumId="27" w15:restartNumberingAfterBreak="0">
+  <w:abstractNum w:abstractNumId="29" w15:restartNumberingAfterBreak="0">
     <w:nsid w:val="77B825BE"/>
     <w:multiLevelType w:val="hybridMultilevel"/>
     <w:tmpl w:val="528C23A2"/>
@@ -4057,95 +6117,101 @@
       </w:rPr>
     </w:lvl>
   </w:abstractNum>
-  <w:num w:numId="1">
+  <w:num w:numId="1" w16cid:durableId="184291487">
+    <w:abstractNumId w:val="29"/>
+  </w:num>
+  <w:num w:numId="2" w16cid:durableId="1016157516">
+    <w:abstractNumId w:val="3"/>
+  </w:num>
+  <w:num w:numId="3" w16cid:durableId="1958173559">
+    <w:abstractNumId w:val="15"/>
+  </w:num>
+  <w:num w:numId="4" w16cid:durableId="775444374">
+    <w:abstractNumId w:val="13"/>
+  </w:num>
+  <w:num w:numId="5" w16cid:durableId="1363825105">
+    <w:abstractNumId w:val="9"/>
+  </w:num>
+  <w:num w:numId="6" w16cid:durableId="1776709149">
+    <w:abstractNumId w:val="10"/>
+  </w:num>
+  <w:num w:numId="7" w16cid:durableId="239756192">
+    <w:abstractNumId w:val="1"/>
+  </w:num>
+  <w:num w:numId="8" w16cid:durableId="238557849">
+    <w:abstractNumId w:val="19"/>
+  </w:num>
+  <w:num w:numId="9" w16cid:durableId="1658336441">
+    <w:abstractNumId w:val="8"/>
+  </w:num>
+  <w:num w:numId="10" w16cid:durableId="1858301890">
+    <w:abstractNumId w:val="24"/>
+  </w:num>
+  <w:num w:numId="11" w16cid:durableId="1951934027">
+    <w:abstractNumId w:val="5"/>
+  </w:num>
+  <w:num w:numId="12" w16cid:durableId="141191810">
+    <w:abstractNumId w:val="4"/>
+  </w:num>
+  <w:num w:numId="13" w16cid:durableId="923296031">
+    <w:abstractNumId w:val="26"/>
+  </w:num>
+  <w:num w:numId="14" w16cid:durableId="207762541">
+    <w:abstractNumId w:val="11"/>
+  </w:num>
+  <w:num w:numId="15" w16cid:durableId="1348170624">
+    <w:abstractNumId w:val="25"/>
+  </w:num>
+  <w:num w:numId="16" w16cid:durableId="867716527">
+    <w:abstractNumId w:val="0"/>
+  </w:num>
+  <w:num w:numId="17" w16cid:durableId="694117322">
+    <w:abstractNumId w:val="17"/>
+  </w:num>
+  <w:num w:numId="18" w16cid:durableId="960185635">
+    <w:abstractNumId w:val="2"/>
+  </w:num>
+  <w:num w:numId="19" w16cid:durableId="1460566526">
+    <w:abstractNumId w:val="7"/>
+  </w:num>
+  <w:num w:numId="20" w16cid:durableId="1173959188">
+    <w:abstractNumId w:val="6"/>
+  </w:num>
+  <w:num w:numId="21" w16cid:durableId="71440720">
     <w:abstractNumId w:val="27"/>
   </w:num>
-  <w:num w:numId="2">
-    <w:abstractNumId w:val="3"/>
-  </w:num>
-  <w:num w:numId="3">
-    <w:abstractNumId w:val="14"/>
-  </w:num>
-  <w:num w:numId="4">
-    <w:abstractNumId w:val="13"/>
-  </w:num>
-  <w:num w:numId="5">
-    <w:abstractNumId w:val="9"/>
-  </w:num>
-  <w:num w:numId="6">
-    <w:abstractNumId w:val="10"/>
-  </w:num>
-  <w:num w:numId="7">
-    <w:abstractNumId w:val="1"/>
-  </w:num>
-  <w:num w:numId="8">
+  <w:num w:numId="22" w16cid:durableId="754940664">
     <w:abstractNumId w:val="18"/>
   </w:num>
-  <w:num w:numId="9">
-    <w:abstractNumId w:val="8"/>
+  <w:num w:numId="23" w16cid:durableId="1619605698">
+    <w:abstractNumId w:val="28"/>
   </w:num>
-  <w:num w:numId="10">
+  <w:num w:numId="24" w16cid:durableId="745608275">
+    <w:abstractNumId w:val="23"/>
+  </w:num>
+  <w:num w:numId="25" w16cid:durableId="1832797375">
+    <w:abstractNumId w:val="12"/>
+  </w:num>
+  <w:num w:numId="26" w16cid:durableId="2029063596">
+    <w:abstractNumId w:val="21"/>
+  </w:num>
+  <w:num w:numId="27" w16cid:durableId="970015217">
+    <w:abstractNumId w:val="16"/>
+  </w:num>
+  <w:num w:numId="28" w16cid:durableId="1305502790">
+    <w:abstractNumId w:val="20"/>
+  </w:num>
+  <w:num w:numId="29" w16cid:durableId="520094939">
     <w:abstractNumId w:val="22"/>
   </w:num>
-  <w:num w:numId="11">
-    <w:abstractNumId w:val="5"/>
-  </w:num>
-  <w:num w:numId="12">
-    <w:abstractNumId w:val="4"/>
-  </w:num>
-  <w:num w:numId="13">
-    <w:abstractNumId w:val="24"/>
-  </w:num>
-  <w:num w:numId="14">
-    <w:abstractNumId w:val="11"/>
-  </w:num>
-  <w:num w:numId="15">
-    <w:abstractNumId w:val="23"/>
-  </w:num>
-  <w:num w:numId="16">
-    <w:abstractNumId w:val="0"/>
-  </w:num>
-  <w:num w:numId="17">
-    <w:abstractNumId w:val="16"/>
-  </w:num>
-  <w:num w:numId="18">
-    <w:abstractNumId w:val="2"/>
-  </w:num>
-  <w:num w:numId="19">
-    <w:abstractNumId w:val="7"/>
-  </w:num>
-  <w:num w:numId="20">
-    <w:abstractNumId w:val="6"/>
-  </w:num>
-  <w:num w:numId="21">
-    <w:abstractNumId w:val="25"/>
-  </w:num>
-  <w:num w:numId="22">
-    <w:abstractNumId w:val="17"/>
-  </w:num>
-  <w:num w:numId="23">
-    <w:abstractNumId w:val="26"/>
-  </w:num>
-  <w:num w:numId="24">
-    <w:abstractNumId w:val="21"/>
-  </w:num>
-  <w:num w:numId="25">
-    <w:abstractNumId w:val="12"/>
-  </w:num>
-  <w:num w:numId="26">
-    <w:abstractNumId w:val="20"/>
-  </w:num>
-  <w:num w:numId="27">
-    <w:abstractNumId w:val="15"/>
-  </w:num>
-  <w:num w:numId="28">
-    <w:abstractNumId w:val="19"/>
+  <w:num w:numId="30" w16cid:durableId="982656814">
+    <w:abstractNumId w:val="14"/>
   </w:num>
 </w:numbering>
 </file>
 
 <file path=word/styles.xml><?xml version="1.0" encoding="utf-8"?>
-<w:styles xmlns:mc="http://schemas.openxmlformats.org/markup-compatibility/2006" xmlns:r="http://schemas.openxmlformats.org/officeDocument/2006/relationships" xmlns:w="http://schemas.openxmlformats.org/wordprocessingml/2006/main" xmlns:w14="http://schemas.microsoft.com/office/word/2010/wordml" xmlns:w15="http://schemas.microsoft.com/office/word/2012/wordml" xmlns:w16cid="http://schemas.microsoft.com/office/word/2016/wordml/cid" xmlns:w16se="http://schemas.microsoft.com/office/word/2015/wordml/symex" mc:Ignorable="w14 w15 w16se w16cid">
+<w:styles xmlns:mc="http://schemas.openxmlformats.org/markup-compatibility/2006" xmlns:r="http://schemas.openxmlformats.org/officeDocument/2006/relationships" xmlns:w="http://schemas.openxmlformats.org/wordprocessingml/2006/main" xmlns:w14="http://schemas.microsoft.com/office/word/2010/wordml" xmlns:w15="http://schemas.microsoft.com/office/word/2012/wordml" xmlns:w16cex="http://schemas.microsoft.com/office/word/2018/wordml/cex" xmlns:w16cid="http://schemas.microsoft.com/office/word/2016/wordml/cid" xmlns:w16="http://schemas.microsoft.com/office/word/2018/wordml" xmlns:w16sdtdh="http://schemas.microsoft.com/office/word/2020/wordml/sdtdatahash" xmlns:w16se="http://schemas.microsoft.com/office/word/2015/wordml/symex" mc:Ignorable="w14 w15 w16se w16cid w16 w16cex w16sdtdh">
   <w:docDefaults>
     <w:rPrDefault>
       <w:rPr>
@@ -4163,7 +6229,7 @@
       </w:pPr>
     </w:pPrDefault>
   </w:docDefaults>
-  <w:latentStyles w:defLockedState="0" w:defUIPriority="99" w:defSemiHidden="0" w:defUnhideWhenUsed="0" w:defQFormat="0" w:count="375">
+  <w:latentStyles w:defLockedState="0" w:defUIPriority="99" w:defSemiHidden="0" w:defUnhideWhenUsed="0" w:defQFormat="0" w:count="376">
     <w:lsdException w:name="Normal" w:uiPriority="0" w:qFormat="1"/>
     <w:lsdException w:name="heading 1" w:uiPriority="9" w:qFormat="1"/>
     <w:lsdException w:name="heading 2" w:semiHidden="1" w:uiPriority="9" w:unhideWhenUsed="1" w:qFormat="1"/>
@@ -4539,6 +6605,7 @@
     <w:lsdException w:name="Smart Hyperlink" w:semiHidden="1" w:unhideWhenUsed="1"/>
     <w:lsdException w:name="Hashtag" w:semiHidden="1" w:unhideWhenUsed="1"/>
     <w:lsdException w:name="Unresolved Mention" w:semiHidden="1" w:unhideWhenUsed="1"/>
+    <w:lsdException w:name="Smart Link" w:semiHidden="1" w:unhideWhenUsed="1"/>
   </w:latentStyles>
   <w:style w:type="paragraph" w:default="1" w:styleId="Normal">
     <w:name w:val="Normal"/>
@@ -4551,7 +6618,6 @@
   <w:style w:type="character" w:default="1" w:styleId="Fontepargpadro">
     <w:name w:val="Default Paragraph Font"/>
     <w:uiPriority w:val="1"/>
-    <w:semiHidden/>
     <w:unhideWhenUsed/>
   </w:style>
   <w:style w:type="table" w:default="1" w:styleId="Tabelanormal">

</xml_diff>